<commit_message>
Docs: Se realizo documentacion para la materia
</commit_message>
<xml_diff>
--- a/docs/GPS/3.1b Casos de uso e historias de usuario.docx
+++ b/docs/GPS/3.1b Casos de uso e historias de usuario.docx
@@ -3,7 +3,7 @@
 <w:document xmlns:wpc="http://schemas.microsoft.com/office/word/2010/wordprocessingCanvas" xmlns:cx="http://schemas.microsoft.com/office/drawing/2014/chartex" xmlns:cx1="http://schemas.microsoft.com/office/drawing/2015/9/8/chartex" xmlns:cx2="http://schemas.microsoft.com/office/drawing/2015/10/21/chartex" xmlns:cx3="http://schemas.microsoft.com/office/drawing/2016/5/9/chartex" xmlns:cx4="http://schemas.microsoft.com/office/drawing/2016/5/10/chartex" xmlns:cx5="http://schemas.microsoft.com/office/drawing/2016/5/11/chartex" xmlns:cx6="http://schemas.microsoft.com/office/drawing/2016/5/12/chartex" xmlns:cx7="http://schemas.microsoft.com/office/drawing/2016/5/13/chartex" xmlns:cx8="http://schemas.microsoft.com/office/drawing/2016/5/14/chartex" xmlns:mc="http://schemas.openxmlformats.org/markup-compatibility/2006" xmlns:aink="http://schemas.microsoft.com/office/drawing/2016/ink" xmlns:am3d="http://schemas.microsoft.com/office/drawing/2017/model3d" xmlns:o="urn:schemas-microsoft-com:office:office" xmlns:oel="http://schemas.microsoft.com/office/2019/extlst" xmlns:r="http://schemas.openxmlformats.org/officeDocument/2006/relationships" xmlns:m="http://schemas.openxmlformats.org/officeDocument/2006/math" xmlns:v="urn:schemas-microsoft-com:vml" xmlns:wp14="http://schemas.microsoft.com/office/word/2010/wordprocessingDrawing" xmlns:wp="http://schemas.openxmlformats.org/drawingml/2006/wordprocessingDrawing" xmlns:w10="urn:schemas-microsoft-com:office:word" xmlns:w="http://schemas.openxmlformats.org/wordprocessingml/2006/main" xmlns:w14="http://schemas.microsoft.com/office/word/2010/wordml" xmlns:w15="http://schemas.microsoft.com/office/word/2012/wordml" xmlns:w16cex="http://schemas.microsoft.com/office/word/2018/wordml/cex" xmlns:w16cid="http://schemas.microsoft.com/office/word/2016/wordml/cid" xmlns:w16="http://schemas.microsoft.com/office/word/2018/wordml" xmlns:w16sdtdh="http://schemas.microsoft.com/office/word/2020/wordml/sdtdatahash" xmlns:w16se="http://schemas.microsoft.com/office/word/2015/wordml/symex" xmlns:wpg="http://schemas.microsoft.com/office/word/2010/wordprocessingGroup" xmlns:wpi="http://schemas.microsoft.com/office/word/2010/wordprocessingInk" xmlns:wne="http://schemas.microsoft.com/office/word/2006/wordml" xmlns:wps="http://schemas.microsoft.com/office/word/2010/wordprocessingShape" mc:Ignorable="w14 w15 w16se w16cid w16 w16cex w16sdtdh wp14">
   <w:background w:color="F5F3E7"/>
   <w:body>
-    <w:bookmarkStart w:id="0" w:name="_Toc242812768"/>
+    <w:bookmarkStart w:id="0" w:name="_Toc243037635"/>
     <w:p>
       <w:pPr>
         <w:pStyle w:val="Ttulo1"/>
@@ -717,7 +717,7 @@
           <w:r>
             <w:fldChar w:fldCharType="separate"/>
           </w:r>
-          <w:hyperlink w:anchor="_Toc242812768" w:history="1">
+          <w:hyperlink w:anchor="_Toc243037635" w:history="1">
             <w:r>
               <w:rPr>
                 <w:rStyle w:val="Hipervnculo"/>
@@ -744,7 +744,7 @@
                 <w:noProof/>
                 <w:webHidden/>
               </w:rPr>
-              <w:instrText xml:space="preserve"> PAGEREF _Toc242812768 \h </w:instrText>
+              <w:instrText xml:space="preserve"> PAGEREF _Toc243037635 \h </w:instrText>
             </w:r>
             <w:r>
               <w:rPr>
@@ -792,7 +792,7 @@
               <w14:ligatures w14:val="standardContextual"/>
             </w:rPr>
           </w:pPr>
-          <w:hyperlink w:anchor="_Toc242812769" w:history="1">
+          <w:hyperlink w:anchor="_Toc243037636" w:history="1">
             <w:r>
               <w:rPr>
                 <w:rStyle w:val="Hipervnculo"/>
@@ -820,7 +820,7 @@
                 <w:noProof/>
                 <w:webHidden/>
               </w:rPr>
-              <w:instrText xml:space="preserve"> PAGEREF _Toc242812769 \h </w:instrText>
+              <w:instrText xml:space="preserve"> PAGEREF _Toc243037636 \h </w:instrText>
             </w:r>
             <w:r>
               <w:rPr>
@@ -868,7 +868,7 @@
               <w14:ligatures w14:val="standardContextual"/>
             </w:rPr>
           </w:pPr>
-          <w:hyperlink w:anchor="_Toc242812770" w:history="1">
+          <w:hyperlink w:anchor="_Toc243037637" w:history="1">
             <w:r>
               <w:rPr>
                 <w:rStyle w:val="Hipervnculo"/>
@@ -896,7 +896,7 @@
                 <w:noProof/>
                 <w:webHidden/>
               </w:rPr>
-              <w:instrText xml:space="preserve"> PAGEREF _Toc242812770 \h </w:instrText>
+              <w:instrText xml:space="preserve"> PAGEREF _Toc243037637 \h </w:instrText>
             </w:r>
             <w:r>
               <w:rPr>
@@ -944,7 +944,7 @@
               <w14:ligatures w14:val="standardContextual"/>
             </w:rPr>
           </w:pPr>
-          <w:hyperlink w:anchor="_Toc242812771" w:history="1">
+          <w:hyperlink w:anchor="_Toc243037638" w:history="1">
             <w:r>
               <w:rPr>
                 <w:rStyle w:val="Hipervnculo"/>
@@ -972,7 +972,7 @@
                 <w:noProof/>
                 <w:webHidden/>
               </w:rPr>
-              <w:instrText xml:space="preserve"> PAGEREF _Toc242812771 \h </w:instrText>
+              <w:instrText xml:space="preserve"> PAGEREF _Toc243037638 \h </w:instrText>
             </w:r>
             <w:r>
               <w:rPr>
@@ -1020,7 +1020,7 @@
               <w14:ligatures w14:val="standardContextual"/>
             </w:rPr>
           </w:pPr>
-          <w:hyperlink w:anchor="_Toc242812772" w:history="1">
+          <w:hyperlink w:anchor="_Toc243037639" w:history="1">
             <w:r>
               <w:rPr>
                 <w:rStyle w:val="Hipervnculo"/>
@@ -1048,7 +1048,7 @@
                 <w:noProof/>
                 <w:webHidden/>
               </w:rPr>
-              <w:instrText xml:space="preserve"> PAGEREF _Toc242812772 \h </w:instrText>
+              <w:instrText xml:space="preserve"> PAGEREF _Toc243037639 \h </w:instrText>
             </w:r>
             <w:r>
               <w:rPr>
@@ -1096,7 +1096,7 @@
               <w14:ligatures w14:val="standardContextual"/>
             </w:rPr>
           </w:pPr>
-          <w:hyperlink w:anchor="_Toc242812773" w:history="1">
+          <w:hyperlink w:anchor="_Toc243037640" w:history="1">
             <w:r>
               <w:rPr>
                 <w:rStyle w:val="Hipervnculo"/>
@@ -1124,7 +1124,7 @@
                 <w:noProof/>
                 <w:webHidden/>
               </w:rPr>
-              <w:instrText xml:space="preserve"> PAGEREF _Toc242812773 \h </w:instrText>
+              <w:instrText xml:space="preserve"> PAGEREF _Toc243037640 \h </w:instrText>
             </w:r>
             <w:r>
               <w:rPr>
@@ -1144,7 +1144,7 @@
                 <w:noProof/>
                 <w:webHidden/>
               </w:rPr>
-              <w:t>6</w:t>
+              <w:t>7</w:t>
             </w:r>
             <w:r>
               <w:rPr>
@@ -1172,7 +1172,7 @@
               <w14:ligatures w14:val="standardContextual"/>
             </w:rPr>
           </w:pPr>
-          <w:hyperlink w:anchor="_Toc242812774" w:history="1">
+          <w:hyperlink w:anchor="_Toc243037641" w:history="1">
             <w:r>
               <w:rPr>
                 <w:rStyle w:val="Hipervnculo"/>
@@ -1200,7 +1200,7 @@
                 <w:noProof/>
                 <w:webHidden/>
               </w:rPr>
-              <w:instrText xml:space="preserve"> PAGEREF _Toc242812774 \h </w:instrText>
+              <w:instrText xml:space="preserve"> PAGEREF _Toc243037641 \h </w:instrText>
             </w:r>
             <w:r>
               <w:rPr>
@@ -1220,7 +1220,7 @@
                 <w:noProof/>
                 <w:webHidden/>
               </w:rPr>
-              <w:t>7</w:t>
+              <w:t>8</w:t>
             </w:r>
             <w:r>
               <w:rPr>
@@ -1248,7 +1248,7 @@
               <w14:ligatures w14:val="standardContextual"/>
             </w:rPr>
           </w:pPr>
-          <w:hyperlink w:anchor="_Toc242812775" w:history="1">
+          <w:hyperlink w:anchor="_Toc243037642" w:history="1">
             <w:r>
               <w:rPr>
                 <w:rStyle w:val="Hipervnculo"/>
@@ -1276,7 +1276,7 @@
                 <w:noProof/>
                 <w:webHidden/>
               </w:rPr>
-              <w:instrText xml:space="preserve"> PAGEREF _Toc242812775 \h </w:instrText>
+              <w:instrText xml:space="preserve"> PAGEREF _Toc243037642 \h </w:instrText>
             </w:r>
             <w:r>
               <w:rPr>
@@ -1296,7 +1296,7 @@
                 <w:noProof/>
                 <w:webHidden/>
               </w:rPr>
-              <w:t>8</w:t>
+              <w:t>9</w:t>
             </w:r>
             <w:r>
               <w:rPr>
@@ -1324,7 +1324,7 @@
               <w14:ligatures w14:val="standardContextual"/>
             </w:rPr>
           </w:pPr>
-          <w:hyperlink w:anchor="_Toc242812776" w:history="1">
+          <w:hyperlink w:anchor="_Toc243037643" w:history="1">
             <w:r>
               <w:rPr>
                 <w:rStyle w:val="Hipervnculo"/>
@@ -1352,7 +1352,7 @@
                 <w:noProof/>
                 <w:webHidden/>
               </w:rPr>
-              <w:instrText xml:space="preserve"> PAGEREF _Toc242812776 \h </w:instrText>
+              <w:instrText xml:space="preserve"> PAGEREF _Toc243037643 \h </w:instrText>
             </w:r>
             <w:r>
               <w:rPr>
@@ -1372,7 +1372,7 @@
                 <w:noProof/>
                 <w:webHidden/>
               </w:rPr>
-              <w:t>8</w:t>
+              <w:t>9</w:t>
             </w:r>
             <w:r>
               <w:rPr>
@@ -1398,7 +1398,7 @@
               <w14:ligatures w14:val="standardContextual"/>
             </w:rPr>
           </w:pPr>
-          <w:hyperlink w:anchor="_Toc242812777" w:history="1">
+          <w:hyperlink w:anchor="_Toc243037644" w:history="1">
             <w:r>
               <w:rPr>
                 <w:rStyle w:val="Hipervnculo"/>
@@ -1425,7 +1425,7 @@
                 <w:noProof/>
                 <w:webHidden/>
               </w:rPr>
-              <w:instrText xml:space="preserve"> PAGEREF _Toc242812777 \h </w:instrText>
+              <w:instrText xml:space="preserve"> PAGEREF _Toc243037644 \h </w:instrText>
             </w:r>
             <w:r>
               <w:rPr>
@@ -1445,7 +1445,7 @@
                 <w:noProof/>
                 <w:webHidden/>
               </w:rPr>
-              <w:t>8</w:t>
+              <w:t>9</w:t>
             </w:r>
             <w:r>
               <w:rPr>
@@ -1471,7 +1471,7 @@
               <w14:ligatures w14:val="standardContextual"/>
             </w:rPr>
           </w:pPr>
-          <w:hyperlink w:anchor="_Toc242812778" w:history="1">
+          <w:hyperlink w:anchor="_Toc243037645" w:history="1">
             <w:r>
               <w:rPr>
                 <w:rStyle w:val="Hipervnculo"/>
@@ -1498,7 +1498,7 @@
                 <w:noProof/>
                 <w:webHidden/>
               </w:rPr>
-              <w:instrText xml:space="preserve"> PAGEREF _Toc242812778 \h </w:instrText>
+              <w:instrText xml:space="preserve"> PAGEREF _Toc243037645 \h </w:instrText>
             </w:r>
             <w:r>
               <w:rPr>
@@ -1518,7 +1518,7 @@
                 <w:noProof/>
                 <w:webHidden/>
               </w:rPr>
-              <w:t>8</w:t>
+              <w:t>9</w:t>
             </w:r>
             <w:r>
               <w:rPr>
@@ -1544,7 +1544,7 @@
               <w14:ligatures w14:val="standardContextual"/>
             </w:rPr>
           </w:pPr>
-          <w:hyperlink w:anchor="_Toc242812779" w:history="1">
+          <w:hyperlink w:anchor="_Toc243037646" w:history="1">
             <w:r>
               <w:rPr>
                 <w:rStyle w:val="Hipervnculo"/>
@@ -1571,7 +1571,7 @@
                 <w:noProof/>
                 <w:webHidden/>
               </w:rPr>
-              <w:instrText xml:space="preserve"> PAGEREF _Toc242812779 \h </w:instrText>
+              <w:instrText xml:space="preserve"> PAGEREF _Toc243037646 \h </w:instrText>
             </w:r>
             <w:r>
               <w:rPr>
@@ -1591,7 +1591,7 @@
                 <w:noProof/>
                 <w:webHidden/>
               </w:rPr>
-              <w:t>8</w:t>
+              <w:t>9</w:t>
             </w:r>
             <w:r>
               <w:rPr>
@@ -1619,7 +1619,7 @@
               <w14:ligatures w14:val="standardContextual"/>
             </w:rPr>
           </w:pPr>
-          <w:hyperlink w:anchor="_Toc242812780" w:history="1">
+          <w:hyperlink w:anchor="_Toc243037647" w:history="1">
             <w:r>
               <w:rPr>
                 <w:rStyle w:val="Hipervnculo"/>
@@ -1647,7 +1647,7 @@
                 <w:noProof/>
                 <w:webHidden/>
               </w:rPr>
-              <w:instrText xml:space="preserve"> PAGEREF _Toc242812780 \h </w:instrText>
+              <w:instrText xml:space="preserve"> PAGEREF _Toc243037647 \h </w:instrText>
             </w:r>
             <w:r>
               <w:rPr>
@@ -1667,7 +1667,7 @@
                 <w:noProof/>
                 <w:webHidden/>
               </w:rPr>
-              <w:t>9</w:t>
+              <w:t>10</w:t>
             </w:r>
             <w:r>
               <w:rPr>
@@ -1693,7 +1693,7 @@
               <w14:ligatures w14:val="standardContextual"/>
             </w:rPr>
           </w:pPr>
-          <w:hyperlink w:anchor="_Toc242812781" w:history="1">
+          <w:hyperlink w:anchor="_Toc243037648" w:history="1">
             <w:r>
               <w:rPr>
                 <w:rStyle w:val="Hipervnculo"/>
@@ -1720,7 +1720,7 @@
                 <w:noProof/>
                 <w:webHidden/>
               </w:rPr>
-              <w:instrText xml:space="preserve"> PAGEREF _Toc242812781 \h </w:instrText>
+              <w:instrText xml:space="preserve"> PAGEREF _Toc243037648 \h </w:instrText>
             </w:r>
             <w:r>
               <w:rPr>
@@ -1740,7 +1740,7 @@
                 <w:noProof/>
                 <w:webHidden/>
               </w:rPr>
-              <w:t>9</w:t>
+              <w:t>10</w:t>
             </w:r>
             <w:r>
               <w:rPr>
@@ -1766,7 +1766,7 @@
               <w14:ligatures w14:val="standardContextual"/>
             </w:rPr>
           </w:pPr>
-          <w:hyperlink w:anchor="_Toc242812782" w:history="1">
+          <w:hyperlink w:anchor="_Toc243037649" w:history="1">
             <w:r>
               <w:rPr>
                 <w:rStyle w:val="Hipervnculo"/>
@@ -1793,7 +1793,7 @@
                 <w:noProof/>
                 <w:webHidden/>
               </w:rPr>
-              <w:instrText xml:space="preserve"> PAGEREF _Toc242812782 \h </w:instrText>
+              <w:instrText xml:space="preserve"> PAGEREF _Toc243037649 \h </w:instrText>
             </w:r>
             <w:r>
               <w:rPr>
@@ -1813,7 +1813,7 @@
                 <w:noProof/>
                 <w:webHidden/>
               </w:rPr>
-              <w:t>9</w:t>
+              <w:t>10</w:t>
             </w:r>
             <w:r>
               <w:rPr>
@@ -1839,7 +1839,7 @@
               <w14:ligatures w14:val="standardContextual"/>
             </w:rPr>
           </w:pPr>
-          <w:hyperlink w:anchor="_Toc242812783" w:history="1">
+          <w:hyperlink w:anchor="_Toc243037650" w:history="1">
             <w:r>
               <w:rPr>
                 <w:rStyle w:val="Hipervnculo"/>
@@ -1866,7 +1866,7 @@
                 <w:noProof/>
                 <w:webHidden/>
               </w:rPr>
-              <w:instrText xml:space="preserve"> PAGEREF _Toc242812783 \h </w:instrText>
+              <w:instrText xml:space="preserve"> PAGEREF _Toc243037650 \h </w:instrText>
             </w:r>
             <w:r>
               <w:rPr>
@@ -1886,7 +1886,7 @@
                 <w:noProof/>
                 <w:webHidden/>
               </w:rPr>
-              <w:t>9</w:t>
+              <w:t>10</w:t>
             </w:r>
             <w:r>
               <w:rPr>
@@ -1914,7 +1914,7 @@
               <w14:ligatures w14:val="standardContextual"/>
             </w:rPr>
           </w:pPr>
-          <w:hyperlink w:anchor="_Toc242812784" w:history="1">
+          <w:hyperlink w:anchor="_Toc243037651" w:history="1">
             <w:r>
               <w:rPr>
                 <w:rStyle w:val="Hipervnculo"/>
@@ -1942,7 +1942,7 @@
                 <w:noProof/>
                 <w:webHidden/>
               </w:rPr>
-              <w:instrText xml:space="preserve"> PAGEREF _Toc242812784 \h </w:instrText>
+              <w:instrText xml:space="preserve"> PAGEREF _Toc243037651 \h </w:instrText>
             </w:r>
             <w:r>
               <w:rPr>
@@ -1962,7 +1962,7 @@
                 <w:noProof/>
                 <w:webHidden/>
               </w:rPr>
-              <w:t>10</w:t>
+              <w:t>11</w:t>
             </w:r>
             <w:r>
               <w:rPr>
@@ -1988,7 +1988,7 @@
               <w14:ligatures w14:val="standardContextual"/>
             </w:rPr>
           </w:pPr>
-          <w:hyperlink w:anchor="_Toc242812785" w:history="1">
+          <w:hyperlink w:anchor="_Toc243037652" w:history="1">
             <w:r>
               <w:rPr>
                 <w:rStyle w:val="Hipervnculo"/>
@@ -2015,7 +2015,7 @@
                 <w:noProof/>
                 <w:webHidden/>
               </w:rPr>
-              <w:instrText xml:space="preserve"> PAGEREF _Toc242812785 \h </w:instrText>
+              <w:instrText xml:space="preserve"> PAGEREF _Toc243037652 \h </w:instrText>
             </w:r>
             <w:r>
               <w:rPr>
@@ -2035,7 +2035,7 @@
                 <w:noProof/>
                 <w:webHidden/>
               </w:rPr>
-              <w:t>10</w:t>
+              <w:t>11</w:t>
             </w:r>
             <w:r>
               <w:rPr>
@@ -2061,7 +2061,7 @@
               <w14:ligatures w14:val="standardContextual"/>
             </w:rPr>
           </w:pPr>
-          <w:hyperlink w:anchor="_Toc242812786" w:history="1">
+          <w:hyperlink w:anchor="_Toc243037653" w:history="1">
             <w:r>
               <w:rPr>
                 <w:rStyle w:val="Hipervnculo"/>
@@ -2088,7 +2088,7 @@
                 <w:noProof/>
                 <w:webHidden/>
               </w:rPr>
-              <w:instrText xml:space="preserve"> PAGEREF _Toc242812786 \h </w:instrText>
+              <w:instrText xml:space="preserve"> PAGEREF _Toc243037653 \h </w:instrText>
             </w:r>
             <w:r>
               <w:rPr>
@@ -2108,7 +2108,7 @@
                 <w:noProof/>
                 <w:webHidden/>
               </w:rPr>
-              <w:t>10</w:t>
+              <w:t>11</w:t>
             </w:r>
             <w:r>
               <w:rPr>
@@ -2134,7 +2134,7 @@
               <w14:ligatures w14:val="standardContextual"/>
             </w:rPr>
           </w:pPr>
-          <w:hyperlink w:anchor="_Toc242812787" w:history="1">
+          <w:hyperlink w:anchor="_Toc243037654" w:history="1">
             <w:r>
               <w:rPr>
                 <w:rStyle w:val="Hipervnculo"/>
@@ -2161,7 +2161,7 @@
                 <w:noProof/>
                 <w:webHidden/>
               </w:rPr>
-              <w:instrText xml:space="preserve"> PAGEREF _Toc242812787 \h </w:instrText>
+              <w:instrText xml:space="preserve"> PAGEREF _Toc243037654 \h </w:instrText>
             </w:r>
             <w:r>
               <w:rPr>
@@ -2181,7 +2181,7 @@
                 <w:noProof/>
                 <w:webHidden/>
               </w:rPr>
-              <w:t>10</w:t>
+              <w:t>11</w:t>
             </w:r>
             <w:r>
               <w:rPr>
@@ -2209,7 +2209,7 @@
               <w14:ligatures w14:val="standardContextual"/>
             </w:rPr>
           </w:pPr>
-          <w:hyperlink w:anchor="_Toc242812788" w:history="1">
+          <w:hyperlink w:anchor="_Toc243037655" w:history="1">
             <w:r>
               <w:rPr>
                 <w:rStyle w:val="Hipervnculo"/>
@@ -2237,7 +2237,7 @@
                 <w:noProof/>
                 <w:webHidden/>
               </w:rPr>
-              <w:instrText xml:space="preserve"> PAGEREF _Toc242812788 \h </w:instrText>
+              <w:instrText xml:space="preserve"> PAGEREF _Toc243037655 \h </w:instrText>
             </w:r>
             <w:r>
               <w:rPr>
@@ -2257,7 +2257,7 @@
                 <w:noProof/>
                 <w:webHidden/>
               </w:rPr>
-              <w:t>11</w:t>
+              <w:t>12</w:t>
             </w:r>
             <w:r>
               <w:rPr>
@@ -2283,7 +2283,7 @@
               <w14:ligatures w14:val="standardContextual"/>
             </w:rPr>
           </w:pPr>
-          <w:hyperlink w:anchor="_Toc242812789" w:history="1">
+          <w:hyperlink w:anchor="_Toc243037656" w:history="1">
             <w:r>
               <w:rPr>
                 <w:rStyle w:val="Hipervnculo"/>
@@ -2310,7 +2310,7 @@
                 <w:noProof/>
                 <w:webHidden/>
               </w:rPr>
-              <w:instrText xml:space="preserve"> PAGEREF _Toc242812789 \h </w:instrText>
+              <w:instrText xml:space="preserve"> PAGEREF _Toc243037656 \h </w:instrText>
             </w:r>
             <w:r>
               <w:rPr>
@@ -2330,7 +2330,7 @@
                 <w:noProof/>
                 <w:webHidden/>
               </w:rPr>
-              <w:t>11</w:t>
+              <w:t>12</w:t>
             </w:r>
             <w:r>
               <w:rPr>
@@ -2356,7 +2356,7 @@
               <w14:ligatures w14:val="standardContextual"/>
             </w:rPr>
           </w:pPr>
-          <w:hyperlink w:anchor="_Toc242812790" w:history="1">
+          <w:hyperlink w:anchor="_Toc243037657" w:history="1">
             <w:r>
               <w:rPr>
                 <w:rStyle w:val="Hipervnculo"/>
@@ -2383,7 +2383,7 @@
                 <w:noProof/>
                 <w:webHidden/>
               </w:rPr>
-              <w:instrText xml:space="preserve"> PAGEREF _Toc242812790 \h </w:instrText>
+              <w:instrText xml:space="preserve"> PAGEREF _Toc243037657 \h </w:instrText>
             </w:r>
             <w:r>
               <w:rPr>
@@ -2403,7 +2403,7 @@
                 <w:noProof/>
                 <w:webHidden/>
               </w:rPr>
-              <w:t>11</w:t>
+              <w:t>12</w:t>
             </w:r>
             <w:r>
               <w:rPr>
@@ -2429,7 +2429,7 @@
               <w14:ligatures w14:val="standardContextual"/>
             </w:rPr>
           </w:pPr>
-          <w:hyperlink w:anchor="_Toc242812791" w:history="1">
+          <w:hyperlink w:anchor="_Toc243037658" w:history="1">
             <w:r>
               <w:rPr>
                 <w:rStyle w:val="Hipervnculo"/>
@@ -2456,7 +2456,7 @@
                 <w:noProof/>
                 <w:webHidden/>
               </w:rPr>
-              <w:instrText xml:space="preserve"> PAGEREF _Toc242812791 \h </w:instrText>
+              <w:instrText xml:space="preserve"> PAGEREF _Toc243037658 \h </w:instrText>
             </w:r>
             <w:r>
               <w:rPr>
@@ -2476,7 +2476,7 @@
                 <w:noProof/>
                 <w:webHidden/>
               </w:rPr>
-              <w:t>11</w:t>
+              <w:t>12</w:t>
             </w:r>
             <w:r>
               <w:rPr>
@@ -2504,7 +2504,7 @@
               <w14:ligatures w14:val="standardContextual"/>
             </w:rPr>
           </w:pPr>
-          <w:hyperlink w:anchor="_Toc242812792" w:history="1">
+          <w:hyperlink w:anchor="_Toc243037659" w:history="1">
             <w:r>
               <w:rPr>
                 <w:rStyle w:val="Hipervnculo"/>
@@ -2532,7 +2532,7 @@
                 <w:noProof/>
                 <w:webHidden/>
               </w:rPr>
-              <w:instrText xml:space="preserve"> PAGEREF _Toc242812792 \h </w:instrText>
+              <w:instrText xml:space="preserve"> PAGEREF _Toc243037659 \h </w:instrText>
             </w:r>
             <w:r>
               <w:rPr>
@@ -2552,7 +2552,7 @@
                 <w:noProof/>
                 <w:webHidden/>
               </w:rPr>
-              <w:t>12</w:t>
+              <w:t>13</w:t>
             </w:r>
             <w:r>
               <w:rPr>
@@ -2578,7 +2578,7 @@
               <w14:ligatures w14:val="standardContextual"/>
             </w:rPr>
           </w:pPr>
-          <w:hyperlink w:anchor="_Toc242812793" w:history="1">
+          <w:hyperlink w:anchor="_Toc243037660" w:history="1">
             <w:r>
               <w:rPr>
                 <w:rStyle w:val="Hipervnculo"/>
@@ -2605,7 +2605,7 @@
                 <w:noProof/>
                 <w:webHidden/>
               </w:rPr>
-              <w:instrText xml:space="preserve"> PAGEREF _Toc242812793 \h </w:instrText>
+              <w:instrText xml:space="preserve"> PAGEREF _Toc243037660 \h </w:instrText>
             </w:r>
             <w:r>
               <w:rPr>
@@ -2625,7 +2625,7 @@
                 <w:noProof/>
                 <w:webHidden/>
               </w:rPr>
-              <w:t>12</w:t>
+              <w:t>13</w:t>
             </w:r>
             <w:r>
               <w:rPr>
@@ -2651,7 +2651,7 @@
               <w14:ligatures w14:val="standardContextual"/>
             </w:rPr>
           </w:pPr>
-          <w:hyperlink w:anchor="_Toc242812794" w:history="1">
+          <w:hyperlink w:anchor="_Toc243037661" w:history="1">
             <w:r>
               <w:rPr>
                 <w:rStyle w:val="Hipervnculo"/>
@@ -2678,7 +2678,7 @@
                 <w:noProof/>
                 <w:webHidden/>
               </w:rPr>
-              <w:instrText xml:space="preserve"> PAGEREF _Toc242812794 \h </w:instrText>
+              <w:instrText xml:space="preserve"> PAGEREF _Toc243037661 \h </w:instrText>
             </w:r>
             <w:r>
               <w:rPr>
@@ -2698,7 +2698,7 @@
                 <w:noProof/>
                 <w:webHidden/>
               </w:rPr>
-              <w:t>12</w:t>
+              <w:t>13</w:t>
             </w:r>
             <w:r>
               <w:rPr>
@@ -2724,7 +2724,7 @@
               <w14:ligatures w14:val="standardContextual"/>
             </w:rPr>
           </w:pPr>
-          <w:hyperlink w:anchor="_Toc242812795" w:history="1">
+          <w:hyperlink w:anchor="_Toc243037662" w:history="1">
             <w:r>
               <w:rPr>
                 <w:rStyle w:val="Hipervnculo"/>
@@ -2751,7 +2751,7 @@
                 <w:noProof/>
                 <w:webHidden/>
               </w:rPr>
-              <w:instrText xml:space="preserve"> PAGEREF _Toc242812795 \h </w:instrText>
+              <w:instrText xml:space="preserve"> PAGEREF _Toc243037662 \h </w:instrText>
             </w:r>
             <w:r>
               <w:rPr>
@@ -2771,7 +2771,7 @@
                 <w:noProof/>
                 <w:webHidden/>
               </w:rPr>
-              <w:t>12</w:t>
+              <w:t>13</w:t>
             </w:r>
             <w:r>
               <w:rPr>
@@ -2799,7 +2799,7 @@
               <w14:ligatures w14:val="standardContextual"/>
             </w:rPr>
           </w:pPr>
-          <w:hyperlink w:anchor="_Toc242812796" w:history="1">
+          <w:hyperlink w:anchor="_Toc243037663" w:history="1">
             <w:r>
               <w:rPr>
                 <w:rStyle w:val="Hipervnculo"/>
@@ -2827,7 +2827,7 @@
                 <w:noProof/>
                 <w:webHidden/>
               </w:rPr>
-              <w:instrText xml:space="preserve"> PAGEREF _Toc242812796 \h </w:instrText>
+              <w:instrText xml:space="preserve"> PAGEREF _Toc243037663 \h </w:instrText>
             </w:r>
             <w:r>
               <w:rPr>
@@ -2847,7 +2847,7 @@
                 <w:noProof/>
                 <w:webHidden/>
               </w:rPr>
-              <w:t>13</w:t>
+              <w:t>14</w:t>
             </w:r>
             <w:r>
               <w:rPr>
@@ -2873,7 +2873,7 @@
               <w14:ligatures w14:val="standardContextual"/>
             </w:rPr>
           </w:pPr>
-          <w:hyperlink w:anchor="_Toc242812797" w:history="1">
+          <w:hyperlink w:anchor="_Toc243037664" w:history="1">
             <w:r>
               <w:rPr>
                 <w:rStyle w:val="Hipervnculo"/>
@@ -2900,7 +2900,7 @@
                 <w:noProof/>
                 <w:webHidden/>
               </w:rPr>
-              <w:instrText xml:space="preserve"> PAGEREF _Toc242812797 \h </w:instrText>
+              <w:instrText xml:space="preserve"> PAGEREF _Toc243037664 \h </w:instrText>
             </w:r>
             <w:r>
               <w:rPr>
@@ -2920,7 +2920,7 @@
                 <w:noProof/>
                 <w:webHidden/>
               </w:rPr>
-              <w:t>13</w:t>
+              <w:t>14</w:t>
             </w:r>
             <w:r>
               <w:rPr>
@@ -2946,7 +2946,7 @@
               <w14:ligatures w14:val="standardContextual"/>
             </w:rPr>
           </w:pPr>
-          <w:hyperlink w:anchor="_Toc242812798" w:history="1">
+          <w:hyperlink w:anchor="_Toc243037665" w:history="1">
             <w:r>
               <w:rPr>
                 <w:rStyle w:val="Hipervnculo"/>
@@ -2973,7 +2973,7 @@
                 <w:noProof/>
                 <w:webHidden/>
               </w:rPr>
-              <w:instrText xml:space="preserve"> PAGEREF _Toc242812798 \h </w:instrText>
+              <w:instrText xml:space="preserve"> PAGEREF _Toc243037665 \h </w:instrText>
             </w:r>
             <w:r>
               <w:rPr>
@@ -2993,7 +2993,7 @@
                 <w:noProof/>
                 <w:webHidden/>
               </w:rPr>
-              <w:t>13</w:t>
+              <w:t>14</w:t>
             </w:r>
             <w:r>
               <w:rPr>
@@ -3019,7 +3019,7 @@
               <w14:ligatures w14:val="standardContextual"/>
             </w:rPr>
           </w:pPr>
-          <w:hyperlink w:anchor="_Toc242812799" w:history="1">
+          <w:hyperlink w:anchor="_Toc243037666" w:history="1">
             <w:r>
               <w:rPr>
                 <w:rStyle w:val="Hipervnculo"/>
@@ -3046,7 +3046,7 @@
                 <w:noProof/>
                 <w:webHidden/>
               </w:rPr>
-              <w:instrText xml:space="preserve"> PAGEREF _Toc242812799 \h </w:instrText>
+              <w:instrText xml:space="preserve"> PAGEREF _Toc243037666 \h </w:instrText>
             </w:r>
             <w:r>
               <w:rPr>
@@ -3066,7 +3066,7 @@
                 <w:noProof/>
                 <w:webHidden/>
               </w:rPr>
-              <w:t>13</w:t>
+              <w:t>14</w:t>
             </w:r>
             <w:r>
               <w:rPr>
@@ -3092,7 +3092,7 @@
               <w14:ligatures w14:val="standardContextual"/>
             </w:rPr>
           </w:pPr>
-          <w:hyperlink w:anchor="_Toc242812800" w:history="1">
+          <w:hyperlink w:anchor="_Toc243037667" w:history="1">
             <w:r>
               <w:rPr>
                 <w:rStyle w:val="Hipervnculo"/>
@@ -3119,7 +3119,7 @@
                 <w:noProof/>
                 <w:webHidden/>
               </w:rPr>
-              <w:instrText xml:space="preserve"> PAGEREF _Toc242812800 \h </w:instrText>
+              <w:instrText xml:space="preserve"> PAGEREF _Toc243037667 \h </w:instrText>
             </w:r>
             <w:r>
               <w:rPr>
@@ -3139,7 +3139,7 @@
                 <w:noProof/>
                 <w:webHidden/>
               </w:rPr>
-              <w:t>13</w:t>
+              <w:t>14</w:t>
             </w:r>
             <w:r>
               <w:rPr>
@@ -3167,7 +3167,7 @@
               <w14:ligatures w14:val="standardContextual"/>
             </w:rPr>
           </w:pPr>
-          <w:hyperlink w:anchor="_Toc242812801" w:history="1">
+          <w:hyperlink w:anchor="_Toc243037668" w:history="1">
             <w:r>
               <w:rPr>
                 <w:rStyle w:val="Hipervnculo"/>
@@ -3195,7 +3195,7 @@
                 <w:noProof/>
                 <w:webHidden/>
               </w:rPr>
-              <w:instrText xml:space="preserve"> PAGEREF _Toc242812801 \h </w:instrText>
+              <w:instrText xml:space="preserve"> PAGEREF _Toc243037668 \h </w:instrText>
             </w:r>
             <w:r>
               <w:rPr>
@@ -3215,7 +3215,7 @@
                 <w:noProof/>
                 <w:webHidden/>
               </w:rPr>
-              <w:t>14</w:t>
+              <w:t>15</w:t>
             </w:r>
             <w:r>
               <w:rPr>
@@ -3241,7 +3241,7 @@
               <w14:ligatures w14:val="standardContextual"/>
             </w:rPr>
           </w:pPr>
-          <w:hyperlink w:anchor="_Toc242812802" w:history="1">
+          <w:hyperlink w:anchor="_Toc243037669" w:history="1">
             <w:r>
               <w:rPr>
                 <w:rStyle w:val="Hipervnculo"/>
@@ -3268,7 +3268,7 @@
                 <w:noProof/>
                 <w:webHidden/>
               </w:rPr>
-              <w:instrText xml:space="preserve"> PAGEREF _Toc242812802 \h </w:instrText>
+              <w:instrText xml:space="preserve"> PAGEREF _Toc243037669 \h </w:instrText>
             </w:r>
             <w:r>
               <w:rPr>
@@ -3288,7 +3288,7 @@
                 <w:noProof/>
                 <w:webHidden/>
               </w:rPr>
-              <w:t>14</w:t>
+              <w:t>15</w:t>
             </w:r>
             <w:r>
               <w:rPr>
@@ -3314,7 +3314,7 @@
               <w14:ligatures w14:val="standardContextual"/>
             </w:rPr>
           </w:pPr>
-          <w:hyperlink w:anchor="_Toc242812803" w:history="1">
+          <w:hyperlink w:anchor="_Toc243037670" w:history="1">
             <w:r>
               <w:rPr>
                 <w:rStyle w:val="Hipervnculo"/>
@@ -3341,7 +3341,7 @@
                 <w:noProof/>
                 <w:webHidden/>
               </w:rPr>
-              <w:instrText xml:space="preserve"> PAGEREF _Toc242812803 \h </w:instrText>
+              <w:instrText xml:space="preserve"> PAGEREF _Toc243037670 \h </w:instrText>
             </w:r>
             <w:r>
               <w:rPr>
@@ -3361,7 +3361,7 @@
                 <w:noProof/>
                 <w:webHidden/>
               </w:rPr>
-              <w:t>14</w:t>
+              <w:t>15</w:t>
             </w:r>
             <w:r>
               <w:rPr>
@@ -3387,7 +3387,7 @@
               <w14:ligatures w14:val="standardContextual"/>
             </w:rPr>
           </w:pPr>
-          <w:hyperlink w:anchor="_Toc242812804" w:history="1">
+          <w:hyperlink w:anchor="_Toc243037671" w:history="1">
             <w:r>
               <w:rPr>
                 <w:rStyle w:val="Hipervnculo"/>
@@ -3414,7 +3414,7 @@
                 <w:noProof/>
                 <w:webHidden/>
               </w:rPr>
-              <w:instrText xml:space="preserve"> PAGEREF _Toc242812804 \h </w:instrText>
+              <w:instrText xml:space="preserve"> PAGEREF _Toc243037671 \h </w:instrText>
             </w:r>
             <w:r>
               <w:rPr>
@@ -3434,7 +3434,7 @@
                 <w:noProof/>
                 <w:webHidden/>
               </w:rPr>
-              <w:t>14</w:t>
+              <w:t>15</w:t>
             </w:r>
             <w:r>
               <w:rPr>
@@ -3462,7 +3462,7 @@
               <w14:ligatures w14:val="standardContextual"/>
             </w:rPr>
           </w:pPr>
-          <w:hyperlink w:anchor="_Toc242812805" w:history="1">
+          <w:hyperlink w:anchor="_Toc243037672" w:history="1">
             <w:r>
               <w:rPr>
                 <w:rStyle w:val="Hipervnculo"/>
@@ -3490,7 +3490,7 @@
                 <w:noProof/>
                 <w:webHidden/>
               </w:rPr>
-              <w:instrText xml:space="preserve"> PAGEREF _Toc242812805 \h </w:instrText>
+              <w:instrText xml:space="preserve"> PAGEREF _Toc243037672 \h </w:instrText>
             </w:r>
             <w:r>
               <w:rPr>
@@ -3510,7 +3510,7 @@
                 <w:noProof/>
                 <w:webHidden/>
               </w:rPr>
-              <w:t>15</w:t>
+              <w:t>16</w:t>
             </w:r>
             <w:r>
               <w:rPr>
@@ -3536,7 +3536,7 @@
               <w14:ligatures w14:val="standardContextual"/>
             </w:rPr>
           </w:pPr>
-          <w:hyperlink w:anchor="_Toc242812806" w:history="1">
+          <w:hyperlink w:anchor="_Toc243037673" w:history="1">
             <w:r>
               <w:rPr>
                 <w:rStyle w:val="Hipervnculo"/>
@@ -3563,7 +3563,7 @@
                 <w:noProof/>
                 <w:webHidden/>
               </w:rPr>
-              <w:instrText xml:space="preserve"> PAGEREF _Toc242812806 \h </w:instrText>
+              <w:instrText xml:space="preserve"> PAGEREF _Toc243037673 \h </w:instrText>
             </w:r>
             <w:r>
               <w:rPr>
@@ -3583,7 +3583,7 @@
                 <w:noProof/>
                 <w:webHidden/>
               </w:rPr>
-              <w:t>15</w:t>
+              <w:t>16</w:t>
             </w:r>
             <w:r>
               <w:rPr>
@@ -3609,7 +3609,7 @@
               <w14:ligatures w14:val="standardContextual"/>
             </w:rPr>
           </w:pPr>
-          <w:hyperlink w:anchor="_Toc242812807" w:history="1">
+          <w:hyperlink w:anchor="_Toc243037674" w:history="1">
             <w:r>
               <w:rPr>
                 <w:rStyle w:val="Hipervnculo"/>
@@ -3636,7 +3636,7 @@
                 <w:noProof/>
                 <w:webHidden/>
               </w:rPr>
-              <w:instrText xml:space="preserve"> PAGEREF _Toc242812807 \h </w:instrText>
+              <w:instrText xml:space="preserve"> PAGEREF _Toc243037674 \h </w:instrText>
             </w:r>
             <w:r>
               <w:rPr>
@@ -3656,7 +3656,7 @@
                 <w:noProof/>
                 <w:webHidden/>
               </w:rPr>
-              <w:t>15</w:t>
+              <w:t>16</w:t>
             </w:r>
             <w:r>
               <w:rPr>
@@ -3682,7 +3682,7 @@
               <w14:ligatures w14:val="standardContextual"/>
             </w:rPr>
           </w:pPr>
-          <w:hyperlink w:anchor="_Toc242812808" w:history="1">
+          <w:hyperlink w:anchor="_Toc243037675" w:history="1">
             <w:r>
               <w:rPr>
                 <w:rStyle w:val="Hipervnculo"/>
@@ -3709,7 +3709,7 @@
                 <w:noProof/>
                 <w:webHidden/>
               </w:rPr>
-              <w:instrText xml:space="preserve"> PAGEREF _Toc242812808 \h </w:instrText>
+              <w:instrText xml:space="preserve"> PAGEREF _Toc243037675 \h </w:instrText>
             </w:r>
             <w:r>
               <w:rPr>
@@ -3729,7 +3729,7 @@
                 <w:noProof/>
                 <w:webHidden/>
               </w:rPr>
-              <w:t>15</w:t>
+              <w:t>16</w:t>
             </w:r>
             <w:r>
               <w:rPr>
@@ -3755,7 +3755,7 @@
               <w14:ligatures w14:val="standardContextual"/>
             </w:rPr>
           </w:pPr>
-          <w:hyperlink w:anchor="_Toc242812809" w:history="1">
+          <w:hyperlink w:anchor="_Toc243037676" w:history="1">
             <w:r>
               <w:rPr>
                 <w:rStyle w:val="Hipervnculo"/>
@@ -3782,7 +3782,7 @@
                 <w:noProof/>
                 <w:webHidden/>
               </w:rPr>
-              <w:instrText xml:space="preserve"> PAGEREF _Toc242812809 \h </w:instrText>
+              <w:instrText xml:space="preserve"> PAGEREF _Toc243037676 \h </w:instrText>
             </w:r>
             <w:r>
               <w:rPr>
@@ -3802,7 +3802,7 @@
                 <w:noProof/>
                 <w:webHidden/>
               </w:rPr>
-              <w:t>15</w:t>
+              <w:t>16</w:t>
             </w:r>
             <w:r>
               <w:rPr>
@@ -3830,7 +3830,7 @@
               <w14:ligatures w14:val="standardContextual"/>
             </w:rPr>
           </w:pPr>
-          <w:hyperlink w:anchor="_Toc242812810" w:history="1">
+          <w:hyperlink w:anchor="_Toc243037677" w:history="1">
             <w:r>
               <w:rPr>
                 <w:rStyle w:val="Hipervnculo"/>
@@ -3858,7 +3858,7 @@
                 <w:noProof/>
                 <w:webHidden/>
               </w:rPr>
-              <w:instrText xml:space="preserve"> PAGEREF _Toc242812810 \h </w:instrText>
+              <w:instrText xml:space="preserve"> PAGEREF _Toc243037677 \h </w:instrText>
             </w:r>
             <w:r>
               <w:rPr>
@@ -3878,7 +3878,7 @@
                 <w:noProof/>
                 <w:webHidden/>
               </w:rPr>
-              <w:t>16</w:t>
+              <w:t>17</w:t>
             </w:r>
             <w:r>
               <w:rPr>
@@ -3904,7 +3904,7 @@
               <w14:ligatures w14:val="standardContextual"/>
             </w:rPr>
           </w:pPr>
-          <w:hyperlink w:anchor="_Toc242812811" w:history="1">
+          <w:hyperlink w:anchor="_Toc243037678" w:history="1">
             <w:r>
               <w:rPr>
                 <w:rStyle w:val="Hipervnculo"/>
@@ -3931,7 +3931,7 @@
                 <w:noProof/>
                 <w:webHidden/>
               </w:rPr>
-              <w:instrText xml:space="preserve"> PAGEREF _Toc242812811 \h </w:instrText>
+              <w:instrText xml:space="preserve"> PAGEREF _Toc243037678 \h </w:instrText>
             </w:r>
             <w:r>
               <w:rPr>
@@ -3951,7 +3951,7 @@
                 <w:noProof/>
                 <w:webHidden/>
               </w:rPr>
-              <w:t>16</w:t>
+              <w:t>17</w:t>
             </w:r>
             <w:r>
               <w:rPr>
@@ -3977,7 +3977,7 @@
               <w14:ligatures w14:val="standardContextual"/>
             </w:rPr>
           </w:pPr>
-          <w:hyperlink w:anchor="_Toc242812812" w:history="1">
+          <w:hyperlink w:anchor="_Toc243037679" w:history="1">
             <w:r>
               <w:rPr>
                 <w:rStyle w:val="Hipervnculo"/>
@@ -4004,7 +4004,7 @@
                 <w:noProof/>
                 <w:webHidden/>
               </w:rPr>
-              <w:instrText xml:space="preserve"> PAGEREF _Toc242812812 \h </w:instrText>
+              <w:instrText xml:space="preserve"> PAGEREF _Toc243037679 \h </w:instrText>
             </w:r>
             <w:r>
               <w:rPr>
@@ -4024,7 +4024,7 @@
                 <w:noProof/>
                 <w:webHidden/>
               </w:rPr>
-              <w:t>16</w:t>
+              <w:t>17</w:t>
             </w:r>
             <w:r>
               <w:rPr>
@@ -4050,7 +4050,7 @@
               <w14:ligatures w14:val="standardContextual"/>
             </w:rPr>
           </w:pPr>
-          <w:hyperlink w:anchor="_Toc242812813" w:history="1">
+          <w:hyperlink w:anchor="_Toc243037680" w:history="1">
             <w:r>
               <w:rPr>
                 <w:rStyle w:val="Hipervnculo"/>
@@ -4077,7 +4077,7 @@
                 <w:noProof/>
                 <w:webHidden/>
               </w:rPr>
-              <w:instrText xml:space="preserve"> PAGEREF _Toc242812813 \h </w:instrText>
+              <w:instrText xml:space="preserve"> PAGEREF _Toc243037680 \h </w:instrText>
             </w:r>
             <w:r>
               <w:rPr>
@@ -4097,7 +4097,7 @@
                 <w:noProof/>
                 <w:webHidden/>
               </w:rPr>
-              <w:t>16</w:t>
+              <w:t>17</w:t>
             </w:r>
             <w:r>
               <w:rPr>
@@ -4125,7 +4125,7 @@
               <w14:ligatures w14:val="standardContextual"/>
             </w:rPr>
           </w:pPr>
-          <w:hyperlink w:anchor="_Toc242812814" w:history="1">
+          <w:hyperlink w:anchor="_Toc243037681" w:history="1">
             <w:r>
               <w:rPr>
                 <w:rStyle w:val="Hipervnculo"/>
@@ -4153,7 +4153,7 @@
                 <w:noProof/>
                 <w:webHidden/>
               </w:rPr>
-              <w:instrText xml:space="preserve"> PAGEREF _Toc242812814 \h </w:instrText>
+              <w:instrText xml:space="preserve"> PAGEREF _Toc243037681 \h </w:instrText>
             </w:r>
             <w:r>
               <w:rPr>
@@ -4173,7 +4173,7 @@
                 <w:noProof/>
                 <w:webHidden/>
               </w:rPr>
-              <w:t>17</w:t>
+              <w:t>18</w:t>
             </w:r>
             <w:r>
               <w:rPr>
@@ -4199,7 +4199,7 @@
               <w14:ligatures w14:val="standardContextual"/>
             </w:rPr>
           </w:pPr>
-          <w:hyperlink w:anchor="_Toc242812815" w:history="1">
+          <w:hyperlink w:anchor="_Toc243037682" w:history="1">
             <w:r>
               <w:rPr>
                 <w:rStyle w:val="Hipervnculo"/>
@@ -4226,7 +4226,7 @@
                 <w:noProof/>
                 <w:webHidden/>
               </w:rPr>
-              <w:instrText xml:space="preserve"> PAGEREF _Toc242812815 \h </w:instrText>
+              <w:instrText xml:space="preserve"> PAGEREF _Toc243037682 \h </w:instrText>
             </w:r>
             <w:r>
               <w:rPr>
@@ -4246,7 +4246,7 @@
                 <w:noProof/>
                 <w:webHidden/>
               </w:rPr>
-              <w:t>17</w:t>
+              <w:t>18</w:t>
             </w:r>
             <w:r>
               <w:rPr>
@@ -4272,7 +4272,7 @@
               <w14:ligatures w14:val="standardContextual"/>
             </w:rPr>
           </w:pPr>
-          <w:hyperlink w:anchor="_Toc242812816" w:history="1">
+          <w:hyperlink w:anchor="_Toc243037683" w:history="1">
             <w:r>
               <w:rPr>
                 <w:rStyle w:val="Hipervnculo"/>
@@ -4299,7 +4299,7 @@
                 <w:noProof/>
                 <w:webHidden/>
               </w:rPr>
-              <w:instrText xml:space="preserve"> PAGEREF _Toc242812816 \h </w:instrText>
+              <w:instrText xml:space="preserve"> PAGEREF _Toc243037683 \h </w:instrText>
             </w:r>
             <w:r>
               <w:rPr>
@@ -4319,7 +4319,7 @@
                 <w:noProof/>
                 <w:webHidden/>
               </w:rPr>
-              <w:t>17</w:t>
+              <w:t>18</w:t>
             </w:r>
             <w:r>
               <w:rPr>
@@ -4345,7 +4345,7 @@
               <w14:ligatures w14:val="standardContextual"/>
             </w:rPr>
           </w:pPr>
-          <w:hyperlink w:anchor="_Toc242812817" w:history="1">
+          <w:hyperlink w:anchor="_Toc243037684" w:history="1">
             <w:r>
               <w:rPr>
                 <w:rStyle w:val="Hipervnculo"/>
@@ -4372,7 +4372,7 @@
                 <w:noProof/>
                 <w:webHidden/>
               </w:rPr>
-              <w:instrText xml:space="preserve"> PAGEREF _Toc242812817 \h </w:instrText>
+              <w:instrText xml:space="preserve"> PAGEREF _Toc243037684 \h </w:instrText>
             </w:r>
             <w:r>
               <w:rPr>
@@ -4392,7 +4392,7 @@
                 <w:noProof/>
                 <w:webHidden/>
               </w:rPr>
-              <w:t>17</w:t>
+              <w:t>18</w:t>
             </w:r>
             <w:r>
               <w:rPr>
@@ -4420,7 +4420,7 @@
               <w14:ligatures w14:val="standardContextual"/>
             </w:rPr>
           </w:pPr>
-          <w:hyperlink w:anchor="_Toc242812818" w:history="1">
+          <w:hyperlink w:anchor="_Toc243037685" w:history="1">
             <w:r>
               <w:rPr>
                 <w:rStyle w:val="Hipervnculo"/>
@@ -4448,7 +4448,7 @@
                 <w:noProof/>
                 <w:webHidden/>
               </w:rPr>
-              <w:instrText xml:space="preserve"> PAGEREF _Toc242812818 \h </w:instrText>
+              <w:instrText xml:space="preserve"> PAGEREF _Toc243037685 \h </w:instrText>
             </w:r>
             <w:r>
               <w:rPr>
@@ -4468,7 +4468,7 @@
                 <w:noProof/>
                 <w:webHidden/>
               </w:rPr>
-              <w:t>18</w:t>
+              <w:t>19</w:t>
             </w:r>
             <w:r>
               <w:rPr>
@@ -4494,7 +4494,7 @@
               <w14:ligatures w14:val="standardContextual"/>
             </w:rPr>
           </w:pPr>
-          <w:hyperlink w:anchor="_Toc242812819" w:history="1">
+          <w:hyperlink w:anchor="_Toc243037686" w:history="1">
             <w:r>
               <w:rPr>
                 <w:rStyle w:val="Hipervnculo"/>
@@ -4521,7 +4521,7 @@
                 <w:noProof/>
                 <w:webHidden/>
               </w:rPr>
-              <w:instrText xml:space="preserve"> PAGEREF _Toc242812819 \h </w:instrText>
+              <w:instrText xml:space="preserve"> PAGEREF _Toc243037686 \h </w:instrText>
             </w:r>
             <w:r>
               <w:rPr>
@@ -4541,7 +4541,7 @@
                 <w:noProof/>
                 <w:webHidden/>
               </w:rPr>
-              <w:t>18</w:t>
+              <w:t>19</w:t>
             </w:r>
             <w:r>
               <w:rPr>
@@ -4567,7 +4567,7 @@
               <w14:ligatures w14:val="standardContextual"/>
             </w:rPr>
           </w:pPr>
-          <w:hyperlink w:anchor="_Toc242812820" w:history="1">
+          <w:hyperlink w:anchor="_Toc243037687" w:history="1">
             <w:r>
               <w:rPr>
                 <w:rStyle w:val="Hipervnculo"/>
@@ -4594,7 +4594,7 @@
                 <w:noProof/>
                 <w:webHidden/>
               </w:rPr>
-              <w:instrText xml:space="preserve"> PAGEREF _Toc242812820 \h </w:instrText>
+              <w:instrText xml:space="preserve"> PAGEREF _Toc243037687 \h </w:instrText>
             </w:r>
             <w:r>
               <w:rPr>
@@ -4614,7 +4614,7 @@
                 <w:noProof/>
                 <w:webHidden/>
               </w:rPr>
-              <w:t>18</w:t>
+              <w:t>19</w:t>
             </w:r>
             <w:r>
               <w:rPr>
@@ -4640,7 +4640,7 @@
               <w14:ligatures w14:val="standardContextual"/>
             </w:rPr>
           </w:pPr>
-          <w:hyperlink w:anchor="_Toc242812821" w:history="1">
+          <w:hyperlink w:anchor="_Toc243037688" w:history="1">
             <w:r>
               <w:rPr>
                 <w:rStyle w:val="Hipervnculo"/>
@@ -4667,7 +4667,7 @@
                 <w:noProof/>
                 <w:webHidden/>
               </w:rPr>
-              <w:instrText xml:space="preserve"> PAGEREF _Toc242812821 \h </w:instrText>
+              <w:instrText xml:space="preserve"> PAGEREF _Toc243037688 \h </w:instrText>
             </w:r>
             <w:r>
               <w:rPr>
@@ -4687,7 +4687,7 @@
                 <w:noProof/>
                 <w:webHidden/>
               </w:rPr>
-              <w:t>18</w:t>
+              <w:t>19</w:t>
             </w:r>
             <w:r>
               <w:rPr>
@@ -4715,7 +4715,7 @@
               <w14:ligatures w14:val="standardContextual"/>
             </w:rPr>
           </w:pPr>
-          <w:hyperlink w:anchor="_Toc242812822" w:history="1">
+          <w:hyperlink w:anchor="_Toc243037689" w:history="1">
             <w:r>
               <w:rPr>
                 <w:rStyle w:val="Hipervnculo"/>
@@ -4743,7 +4743,7 @@
                 <w:noProof/>
                 <w:webHidden/>
               </w:rPr>
-              <w:instrText xml:space="preserve"> PAGEREF _Toc242812822 \h </w:instrText>
+              <w:instrText xml:space="preserve"> PAGEREF _Toc243037689 \h </w:instrText>
             </w:r>
             <w:r>
               <w:rPr>
@@ -4763,7 +4763,7 @@
                 <w:noProof/>
                 <w:webHidden/>
               </w:rPr>
-              <w:t>19</w:t>
+              <w:t>20</w:t>
             </w:r>
             <w:r>
               <w:rPr>
@@ -4789,7 +4789,7 @@
               <w14:ligatures w14:val="standardContextual"/>
             </w:rPr>
           </w:pPr>
-          <w:hyperlink w:anchor="_Toc242812823" w:history="1">
+          <w:hyperlink w:anchor="_Toc243037690" w:history="1">
             <w:r>
               <w:rPr>
                 <w:rStyle w:val="Hipervnculo"/>
@@ -4816,7 +4816,7 @@
                 <w:noProof/>
                 <w:webHidden/>
               </w:rPr>
-              <w:instrText xml:space="preserve"> PAGEREF _Toc242812823 \h </w:instrText>
+              <w:instrText xml:space="preserve"> PAGEREF _Toc243037690 \h </w:instrText>
             </w:r>
             <w:r>
               <w:rPr>
@@ -4836,7 +4836,7 @@
                 <w:noProof/>
                 <w:webHidden/>
               </w:rPr>
-              <w:t>19</w:t>
+              <w:t>20</w:t>
             </w:r>
             <w:r>
               <w:rPr>
@@ -4862,7 +4862,7 @@
               <w14:ligatures w14:val="standardContextual"/>
             </w:rPr>
           </w:pPr>
-          <w:hyperlink w:anchor="_Toc242812824" w:history="1">
+          <w:hyperlink w:anchor="_Toc243037691" w:history="1">
             <w:r>
               <w:rPr>
                 <w:rStyle w:val="Hipervnculo"/>
@@ -4889,7 +4889,7 @@
                 <w:noProof/>
                 <w:webHidden/>
               </w:rPr>
-              <w:instrText xml:space="preserve"> PAGEREF _Toc242812824 \h </w:instrText>
+              <w:instrText xml:space="preserve"> PAGEREF _Toc243037691 \h </w:instrText>
             </w:r>
             <w:r>
               <w:rPr>
@@ -4909,7 +4909,7 @@
                 <w:noProof/>
                 <w:webHidden/>
               </w:rPr>
-              <w:t>19</w:t>
+              <w:t>20</w:t>
             </w:r>
             <w:r>
               <w:rPr>
@@ -4935,7 +4935,7 @@
               <w14:ligatures w14:val="standardContextual"/>
             </w:rPr>
           </w:pPr>
-          <w:hyperlink w:anchor="_Toc242812825" w:history="1">
+          <w:hyperlink w:anchor="_Toc243037692" w:history="1">
             <w:r>
               <w:rPr>
                 <w:rStyle w:val="Hipervnculo"/>
@@ -4962,7 +4962,7 @@
                 <w:noProof/>
                 <w:webHidden/>
               </w:rPr>
-              <w:instrText xml:space="preserve"> PAGEREF _Toc242812825 \h </w:instrText>
+              <w:instrText xml:space="preserve"> PAGEREF _Toc243037692 \h </w:instrText>
             </w:r>
             <w:r>
               <w:rPr>
@@ -4982,7 +4982,7 @@
                 <w:noProof/>
                 <w:webHidden/>
               </w:rPr>
-              <w:t>19</w:t>
+              <w:t>20</w:t>
             </w:r>
             <w:r>
               <w:rPr>
@@ -5010,7 +5010,7 @@
               <w14:ligatures w14:val="standardContextual"/>
             </w:rPr>
           </w:pPr>
-          <w:hyperlink w:anchor="_Toc242812826" w:history="1">
+          <w:hyperlink w:anchor="_Toc243037693" w:history="1">
             <w:r>
               <w:rPr>
                 <w:rStyle w:val="Hipervnculo"/>
@@ -5038,7 +5038,7 @@
                 <w:noProof/>
                 <w:webHidden/>
               </w:rPr>
-              <w:instrText xml:space="preserve"> PAGEREF _Toc242812826 \h </w:instrText>
+              <w:instrText xml:space="preserve"> PAGEREF _Toc243037693 \h </w:instrText>
             </w:r>
             <w:r>
               <w:rPr>
@@ -5058,7 +5058,7 @@
                 <w:noProof/>
                 <w:webHidden/>
               </w:rPr>
-              <w:t>20</w:t>
+              <w:t>21</w:t>
             </w:r>
             <w:r>
               <w:rPr>
@@ -5084,7 +5084,7 @@
               <w14:ligatures w14:val="standardContextual"/>
             </w:rPr>
           </w:pPr>
-          <w:hyperlink w:anchor="_Toc242812827" w:history="1">
+          <w:hyperlink w:anchor="_Toc243037694" w:history="1">
             <w:r>
               <w:rPr>
                 <w:rStyle w:val="Hipervnculo"/>
@@ -5111,7 +5111,7 @@
                 <w:noProof/>
                 <w:webHidden/>
               </w:rPr>
-              <w:instrText xml:space="preserve"> PAGEREF _Toc242812827 \h </w:instrText>
+              <w:instrText xml:space="preserve"> PAGEREF _Toc243037694 \h </w:instrText>
             </w:r>
             <w:r>
               <w:rPr>
@@ -5131,7 +5131,7 @@
                 <w:noProof/>
                 <w:webHidden/>
               </w:rPr>
-              <w:t>20</w:t>
+              <w:t>21</w:t>
             </w:r>
             <w:r>
               <w:rPr>
@@ -5157,7 +5157,7 @@
               <w14:ligatures w14:val="standardContextual"/>
             </w:rPr>
           </w:pPr>
-          <w:hyperlink w:anchor="_Toc242812828" w:history="1">
+          <w:hyperlink w:anchor="_Toc243037695" w:history="1">
             <w:r>
               <w:rPr>
                 <w:rStyle w:val="Hipervnculo"/>
@@ -5184,7 +5184,7 @@
                 <w:noProof/>
                 <w:webHidden/>
               </w:rPr>
-              <w:instrText xml:space="preserve"> PAGEREF _Toc242812828 \h </w:instrText>
+              <w:instrText xml:space="preserve"> PAGEREF _Toc243037695 \h </w:instrText>
             </w:r>
             <w:r>
               <w:rPr>
@@ -5204,7 +5204,7 @@
                 <w:noProof/>
                 <w:webHidden/>
               </w:rPr>
-              <w:t>20</w:t>
+              <w:t>21</w:t>
             </w:r>
             <w:r>
               <w:rPr>
@@ -5230,7 +5230,7 @@
               <w14:ligatures w14:val="standardContextual"/>
             </w:rPr>
           </w:pPr>
-          <w:hyperlink w:anchor="_Toc242812829" w:history="1">
+          <w:hyperlink w:anchor="_Toc243037696" w:history="1">
             <w:r>
               <w:rPr>
                 <w:rStyle w:val="Hipervnculo"/>
@@ -5257,7 +5257,7 @@
                 <w:noProof/>
                 <w:webHidden/>
               </w:rPr>
-              <w:instrText xml:space="preserve"> PAGEREF _Toc242812829 \h </w:instrText>
+              <w:instrText xml:space="preserve"> PAGEREF _Toc243037696 \h </w:instrText>
             </w:r>
             <w:r>
               <w:rPr>
@@ -5277,7 +5277,7 @@
                 <w:noProof/>
                 <w:webHidden/>
               </w:rPr>
-              <w:t>20</w:t>
+              <w:t>21</w:t>
             </w:r>
             <w:r>
               <w:rPr>
@@ -5303,7 +5303,7 @@
               <w14:ligatures w14:val="standardContextual"/>
             </w:rPr>
           </w:pPr>
-          <w:hyperlink w:anchor="_Toc242812830" w:history="1">
+          <w:hyperlink w:anchor="_Toc243037697" w:history="1">
             <w:r>
               <w:rPr>
                 <w:rStyle w:val="Hipervnculo"/>
@@ -5330,7 +5330,7 @@
                 <w:noProof/>
                 <w:webHidden/>
               </w:rPr>
-              <w:instrText xml:space="preserve"> PAGEREF _Toc242812830 \h </w:instrText>
+              <w:instrText xml:space="preserve"> PAGEREF _Toc243037697 \h </w:instrText>
             </w:r>
             <w:r>
               <w:rPr>
@@ -5350,7 +5350,7 @@
                 <w:noProof/>
                 <w:webHidden/>
               </w:rPr>
-              <w:t>20</w:t>
+              <w:t>21</w:t>
             </w:r>
             <w:r>
               <w:rPr>
@@ -5378,7 +5378,7 @@
               <w14:ligatures w14:val="standardContextual"/>
             </w:rPr>
           </w:pPr>
-          <w:hyperlink w:anchor="_Toc242812831" w:history="1">
+          <w:hyperlink w:anchor="_Toc243037698" w:history="1">
             <w:r>
               <w:rPr>
                 <w:rStyle w:val="Hipervnculo"/>
@@ -5406,7 +5406,7 @@
                 <w:noProof/>
                 <w:webHidden/>
               </w:rPr>
-              <w:instrText xml:space="preserve"> PAGEREF _Toc242812831 \h </w:instrText>
+              <w:instrText xml:space="preserve"> PAGEREF _Toc243037698 \h </w:instrText>
             </w:r>
             <w:r>
               <w:rPr>
@@ -5426,7 +5426,7 @@
                 <w:noProof/>
                 <w:webHidden/>
               </w:rPr>
-              <w:t>21</w:t>
+              <w:t>22</w:t>
             </w:r>
             <w:r>
               <w:rPr>
@@ -5452,7 +5452,7 @@
               <w14:ligatures w14:val="standardContextual"/>
             </w:rPr>
           </w:pPr>
-          <w:hyperlink w:anchor="_Toc242812832" w:history="1">
+          <w:hyperlink w:anchor="_Toc243037699" w:history="1">
             <w:r>
               <w:rPr>
                 <w:rStyle w:val="Hipervnculo"/>
@@ -5479,7 +5479,7 @@
                 <w:noProof/>
                 <w:webHidden/>
               </w:rPr>
-              <w:instrText xml:space="preserve"> PAGEREF _Toc242812832 \h </w:instrText>
+              <w:instrText xml:space="preserve"> PAGEREF _Toc243037699 \h </w:instrText>
             </w:r>
             <w:r>
               <w:rPr>
@@ -5499,7 +5499,7 @@
                 <w:noProof/>
                 <w:webHidden/>
               </w:rPr>
-              <w:t>21</w:t>
+              <w:t>22</w:t>
             </w:r>
             <w:r>
               <w:rPr>
@@ -5525,7 +5525,7 @@
               <w14:ligatures w14:val="standardContextual"/>
             </w:rPr>
           </w:pPr>
-          <w:hyperlink w:anchor="_Toc242812833" w:history="1">
+          <w:hyperlink w:anchor="_Toc243037700" w:history="1">
             <w:r>
               <w:rPr>
                 <w:rStyle w:val="Hipervnculo"/>
@@ -5552,7 +5552,7 @@
                 <w:noProof/>
                 <w:webHidden/>
               </w:rPr>
-              <w:instrText xml:space="preserve"> PAGEREF _Toc242812833 \h </w:instrText>
+              <w:instrText xml:space="preserve"> PAGEREF _Toc243037700 \h </w:instrText>
             </w:r>
             <w:r>
               <w:rPr>
@@ -5572,7 +5572,7 @@
                 <w:noProof/>
                 <w:webHidden/>
               </w:rPr>
-              <w:t>21</w:t>
+              <w:t>22</w:t>
             </w:r>
             <w:r>
               <w:rPr>
@@ -5598,7 +5598,7 @@
               <w14:ligatures w14:val="standardContextual"/>
             </w:rPr>
           </w:pPr>
-          <w:hyperlink w:anchor="_Toc242812834" w:history="1">
+          <w:hyperlink w:anchor="_Toc243037701" w:history="1">
             <w:r>
               <w:rPr>
                 <w:rStyle w:val="Hipervnculo"/>
@@ -5625,7 +5625,7 @@
                 <w:noProof/>
                 <w:webHidden/>
               </w:rPr>
-              <w:instrText xml:space="preserve"> PAGEREF _Toc242812834 \h </w:instrText>
+              <w:instrText xml:space="preserve"> PAGEREF _Toc243037701 \h </w:instrText>
             </w:r>
             <w:r>
               <w:rPr>
@@ -5645,7 +5645,7 @@
                 <w:noProof/>
                 <w:webHidden/>
               </w:rPr>
-              <w:t>21</w:t>
+              <w:t>22</w:t>
             </w:r>
             <w:r>
               <w:rPr>
@@ -5673,7 +5673,7 @@
               <w14:ligatures w14:val="standardContextual"/>
             </w:rPr>
           </w:pPr>
-          <w:hyperlink w:anchor="_Toc242812835" w:history="1">
+          <w:hyperlink w:anchor="_Toc243037702" w:history="1">
             <w:r>
               <w:rPr>
                 <w:rStyle w:val="Hipervnculo"/>
@@ -5701,7 +5701,7 @@
                 <w:noProof/>
                 <w:webHidden/>
               </w:rPr>
-              <w:instrText xml:space="preserve"> PAGEREF _Toc242812835 \h </w:instrText>
+              <w:instrText xml:space="preserve"> PAGEREF _Toc243037702 \h </w:instrText>
             </w:r>
             <w:r>
               <w:rPr>
@@ -5721,7 +5721,7 @@
                 <w:noProof/>
                 <w:webHidden/>
               </w:rPr>
-              <w:t>22</w:t>
+              <w:t>23</w:t>
             </w:r>
             <w:r>
               <w:rPr>
@@ -5747,7 +5747,7 @@
               <w14:ligatures w14:val="standardContextual"/>
             </w:rPr>
           </w:pPr>
-          <w:hyperlink w:anchor="_Toc242812836" w:history="1">
+          <w:hyperlink w:anchor="_Toc243037703" w:history="1">
             <w:r>
               <w:rPr>
                 <w:rStyle w:val="Hipervnculo"/>
@@ -5774,7 +5774,7 @@
                 <w:noProof/>
                 <w:webHidden/>
               </w:rPr>
-              <w:instrText xml:space="preserve"> PAGEREF _Toc242812836 \h </w:instrText>
+              <w:instrText xml:space="preserve"> PAGEREF _Toc243037703 \h </w:instrText>
             </w:r>
             <w:r>
               <w:rPr>
@@ -5794,7 +5794,7 @@
                 <w:noProof/>
                 <w:webHidden/>
               </w:rPr>
-              <w:t>22</w:t>
+              <w:t>23</w:t>
             </w:r>
             <w:r>
               <w:rPr>
@@ -5820,7 +5820,7 @@
               <w14:ligatures w14:val="standardContextual"/>
             </w:rPr>
           </w:pPr>
-          <w:hyperlink w:anchor="_Toc242812837" w:history="1">
+          <w:hyperlink w:anchor="_Toc243037704" w:history="1">
             <w:r>
               <w:rPr>
                 <w:rStyle w:val="Hipervnculo"/>
@@ -5847,7 +5847,7 @@
                 <w:noProof/>
                 <w:webHidden/>
               </w:rPr>
-              <w:instrText xml:space="preserve"> PAGEREF _Toc242812837 \h </w:instrText>
+              <w:instrText xml:space="preserve"> PAGEREF _Toc243037704 \h </w:instrText>
             </w:r>
             <w:r>
               <w:rPr>
@@ -5867,7 +5867,7 @@
                 <w:noProof/>
                 <w:webHidden/>
               </w:rPr>
-              <w:t>22</w:t>
+              <w:t>23</w:t>
             </w:r>
             <w:r>
               <w:rPr>
@@ -5893,7 +5893,7 @@
               <w14:ligatures w14:val="standardContextual"/>
             </w:rPr>
           </w:pPr>
-          <w:hyperlink w:anchor="_Toc242812838" w:history="1">
+          <w:hyperlink w:anchor="_Toc243037705" w:history="1">
             <w:r>
               <w:rPr>
                 <w:rStyle w:val="Hipervnculo"/>
@@ -5920,7 +5920,7 @@
                 <w:noProof/>
                 <w:webHidden/>
               </w:rPr>
-              <w:instrText xml:space="preserve"> PAGEREF _Toc242812838 \h </w:instrText>
+              <w:instrText xml:space="preserve"> PAGEREF _Toc243037705 \h </w:instrText>
             </w:r>
             <w:r>
               <w:rPr>
@@ -5940,7 +5940,7 @@
                 <w:noProof/>
                 <w:webHidden/>
               </w:rPr>
-              <w:t>22</w:t>
+              <w:t>23</w:t>
             </w:r>
             <w:r>
               <w:rPr>
@@ -5968,7 +5968,7 @@
               <w14:ligatures w14:val="standardContextual"/>
             </w:rPr>
           </w:pPr>
-          <w:hyperlink w:anchor="_Toc242812839" w:history="1">
+          <w:hyperlink w:anchor="_Toc243037706" w:history="1">
             <w:r>
               <w:rPr>
                 <w:rStyle w:val="Hipervnculo"/>
@@ -5996,7 +5996,7 @@
                 <w:noProof/>
                 <w:webHidden/>
               </w:rPr>
-              <w:instrText xml:space="preserve"> PAGEREF _Toc242812839 \h </w:instrText>
+              <w:instrText xml:space="preserve"> PAGEREF _Toc243037706 \h </w:instrText>
             </w:r>
             <w:r>
               <w:rPr>
@@ -6016,7 +6016,7 @@
                 <w:noProof/>
                 <w:webHidden/>
               </w:rPr>
-              <w:t>23</w:t>
+              <w:t>24</w:t>
             </w:r>
             <w:r>
               <w:rPr>
@@ -6042,7 +6042,7 @@
               <w14:ligatures w14:val="standardContextual"/>
             </w:rPr>
           </w:pPr>
-          <w:hyperlink w:anchor="_Toc242812840" w:history="1">
+          <w:hyperlink w:anchor="_Toc243037707" w:history="1">
             <w:r>
               <w:rPr>
                 <w:rStyle w:val="Hipervnculo"/>
@@ -6069,7 +6069,7 @@
                 <w:noProof/>
                 <w:webHidden/>
               </w:rPr>
-              <w:instrText xml:space="preserve"> PAGEREF _Toc242812840 \h </w:instrText>
+              <w:instrText xml:space="preserve"> PAGEREF _Toc243037707 \h </w:instrText>
             </w:r>
             <w:r>
               <w:rPr>
@@ -6089,7 +6089,7 @@
                 <w:noProof/>
                 <w:webHidden/>
               </w:rPr>
-              <w:t>23</w:t>
+              <w:t>24</w:t>
             </w:r>
             <w:r>
               <w:rPr>
@@ -6115,7 +6115,7 @@
               <w14:ligatures w14:val="standardContextual"/>
             </w:rPr>
           </w:pPr>
-          <w:hyperlink w:anchor="_Toc242812841" w:history="1">
+          <w:hyperlink w:anchor="_Toc243037708" w:history="1">
             <w:r>
               <w:rPr>
                 <w:rStyle w:val="Hipervnculo"/>
@@ -6142,7 +6142,7 @@
                 <w:noProof/>
                 <w:webHidden/>
               </w:rPr>
-              <w:instrText xml:space="preserve"> PAGEREF _Toc242812841 \h </w:instrText>
+              <w:instrText xml:space="preserve"> PAGEREF _Toc243037708 \h </w:instrText>
             </w:r>
             <w:r>
               <w:rPr>
@@ -6162,7 +6162,7 @@
                 <w:noProof/>
                 <w:webHidden/>
               </w:rPr>
-              <w:t>23</w:t>
+              <w:t>24</w:t>
             </w:r>
             <w:r>
               <w:rPr>
@@ -6188,7 +6188,7 @@
               <w14:ligatures w14:val="standardContextual"/>
             </w:rPr>
           </w:pPr>
-          <w:hyperlink w:anchor="_Toc242812842" w:history="1">
+          <w:hyperlink w:anchor="_Toc243037709" w:history="1">
             <w:r>
               <w:rPr>
                 <w:rStyle w:val="Hipervnculo"/>
@@ -6215,7 +6215,7 @@
                 <w:noProof/>
                 <w:webHidden/>
               </w:rPr>
-              <w:instrText xml:space="preserve"> PAGEREF _Toc242812842 \h </w:instrText>
+              <w:instrText xml:space="preserve"> PAGEREF _Toc243037709 \h </w:instrText>
             </w:r>
             <w:r>
               <w:rPr>
@@ -6235,7 +6235,7 @@
                 <w:noProof/>
                 <w:webHidden/>
               </w:rPr>
-              <w:t>23</w:t>
+              <w:t>24</w:t>
             </w:r>
             <w:r>
               <w:rPr>
@@ -6263,7 +6263,7 @@
               <w14:ligatures w14:val="standardContextual"/>
             </w:rPr>
           </w:pPr>
-          <w:hyperlink w:anchor="_Toc242812843" w:history="1">
+          <w:hyperlink w:anchor="_Toc243037710" w:history="1">
             <w:r>
               <w:rPr>
                 <w:rStyle w:val="Hipervnculo"/>
@@ -6291,7 +6291,7 @@
                 <w:noProof/>
                 <w:webHidden/>
               </w:rPr>
-              <w:instrText xml:space="preserve"> PAGEREF _Toc242812843 \h </w:instrText>
+              <w:instrText xml:space="preserve"> PAGEREF _Toc243037710 \h </w:instrText>
             </w:r>
             <w:r>
               <w:rPr>
@@ -6311,7 +6311,7 @@
                 <w:noProof/>
                 <w:webHidden/>
               </w:rPr>
-              <w:t>24</w:t>
+              <w:t>25</w:t>
             </w:r>
             <w:r>
               <w:rPr>
@@ -6337,7 +6337,7 @@
               <w14:ligatures w14:val="standardContextual"/>
             </w:rPr>
           </w:pPr>
-          <w:hyperlink w:anchor="_Toc242812844" w:history="1">
+          <w:hyperlink w:anchor="_Toc243037711" w:history="1">
             <w:r>
               <w:rPr>
                 <w:rStyle w:val="Hipervnculo"/>
@@ -6364,7 +6364,7 @@
                 <w:noProof/>
                 <w:webHidden/>
               </w:rPr>
-              <w:instrText xml:space="preserve"> PAGEREF _Toc242812844 \h </w:instrText>
+              <w:instrText xml:space="preserve"> PAGEREF _Toc243037711 \h </w:instrText>
             </w:r>
             <w:r>
               <w:rPr>
@@ -6384,7 +6384,7 @@
                 <w:noProof/>
                 <w:webHidden/>
               </w:rPr>
-              <w:t>24</w:t>
+              <w:t>25</w:t>
             </w:r>
             <w:r>
               <w:rPr>
@@ -6410,7 +6410,7 @@
               <w14:ligatures w14:val="standardContextual"/>
             </w:rPr>
           </w:pPr>
-          <w:hyperlink w:anchor="_Toc242812845" w:history="1">
+          <w:hyperlink w:anchor="_Toc243037712" w:history="1">
             <w:r>
               <w:rPr>
                 <w:rStyle w:val="Hipervnculo"/>
@@ -6437,7 +6437,7 @@
                 <w:noProof/>
                 <w:webHidden/>
               </w:rPr>
-              <w:instrText xml:space="preserve"> PAGEREF _Toc242812845 \h </w:instrText>
+              <w:instrText xml:space="preserve"> PAGEREF _Toc243037712 \h </w:instrText>
             </w:r>
             <w:r>
               <w:rPr>
@@ -6457,7 +6457,7 @@
                 <w:noProof/>
                 <w:webHidden/>
               </w:rPr>
-              <w:t>24</w:t>
+              <w:t>25</w:t>
             </w:r>
             <w:r>
               <w:rPr>
@@ -6483,7 +6483,7 @@
               <w14:ligatures w14:val="standardContextual"/>
             </w:rPr>
           </w:pPr>
-          <w:hyperlink w:anchor="_Toc242812846" w:history="1">
+          <w:hyperlink w:anchor="_Toc243037713" w:history="1">
             <w:r>
               <w:rPr>
                 <w:rStyle w:val="Hipervnculo"/>
@@ -6510,7 +6510,7 @@
                 <w:noProof/>
                 <w:webHidden/>
               </w:rPr>
-              <w:instrText xml:space="preserve"> PAGEREF _Toc242812846 \h </w:instrText>
+              <w:instrText xml:space="preserve"> PAGEREF _Toc243037713 \h </w:instrText>
             </w:r>
             <w:r>
               <w:rPr>
@@ -6530,7 +6530,7 @@
                 <w:noProof/>
                 <w:webHidden/>
               </w:rPr>
-              <w:t>24</w:t>
+              <w:t>25</w:t>
             </w:r>
             <w:r>
               <w:rPr>
@@ -6558,7 +6558,7 @@
               <w14:ligatures w14:val="standardContextual"/>
             </w:rPr>
           </w:pPr>
-          <w:hyperlink w:anchor="_Toc242812847" w:history="1">
+          <w:hyperlink w:anchor="_Toc243037714" w:history="1">
             <w:r>
               <w:rPr>
                 <w:rStyle w:val="Hipervnculo"/>
@@ -6586,7 +6586,7 @@
                 <w:noProof/>
                 <w:webHidden/>
               </w:rPr>
-              <w:instrText xml:space="preserve"> PAGEREF _Toc242812847 \h </w:instrText>
+              <w:instrText xml:space="preserve"> PAGEREF _Toc243037714 \h </w:instrText>
             </w:r>
             <w:r>
               <w:rPr>
@@ -6606,7 +6606,7 @@
                 <w:noProof/>
                 <w:webHidden/>
               </w:rPr>
-              <w:t>25</w:t>
+              <w:t>26</w:t>
             </w:r>
             <w:r>
               <w:rPr>
@@ -6632,7 +6632,7 @@
               <w14:ligatures w14:val="standardContextual"/>
             </w:rPr>
           </w:pPr>
-          <w:hyperlink w:anchor="_Toc242812848" w:history="1">
+          <w:hyperlink w:anchor="_Toc243037715" w:history="1">
             <w:r>
               <w:rPr>
                 <w:rStyle w:val="Hipervnculo"/>
@@ -6659,7 +6659,7 @@
                 <w:noProof/>
                 <w:webHidden/>
               </w:rPr>
-              <w:instrText xml:space="preserve"> PAGEREF _Toc242812848 \h </w:instrText>
+              <w:instrText xml:space="preserve"> PAGEREF _Toc243037715 \h </w:instrText>
             </w:r>
             <w:r>
               <w:rPr>
@@ -6679,7 +6679,7 @@
                 <w:noProof/>
                 <w:webHidden/>
               </w:rPr>
-              <w:t>25</w:t>
+              <w:t>26</w:t>
             </w:r>
             <w:r>
               <w:rPr>
@@ -6705,7 +6705,7 @@
               <w14:ligatures w14:val="standardContextual"/>
             </w:rPr>
           </w:pPr>
-          <w:hyperlink w:anchor="_Toc242812849" w:history="1">
+          <w:hyperlink w:anchor="_Toc243037716" w:history="1">
             <w:r>
               <w:rPr>
                 <w:rStyle w:val="Hipervnculo"/>
@@ -6732,7 +6732,7 @@
                 <w:noProof/>
                 <w:webHidden/>
               </w:rPr>
-              <w:instrText xml:space="preserve"> PAGEREF _Toc242812849 \h </w:instrText>
+              <w:instrText xml:space="preserve"> PAGEREF _Toc243037716 \h </w:instrText>
             </w:r>
             <w:r>
               <w:rPr>
@@ -6752,7 +6752,7 @@
                 <w:noProof/>
                 <w:webHidden/>
               </w:rPr>
-              <w:t>25</w:t>
+              <w:t>26</w:t>
             </w:r>
             <w:r>
               <w:rPr>
@@ -6778,7 +6778,7 @@
               <w14:ligatures w14:val="standardContextual"/>
             </w:rPr>
           </w:pPr>
-          <w:hyperlink w:anchor="_Toc242812850" w:history="1">
+          <w:hyperlink w:anchor="_Toc243037717" w:history="1">
             <w:r>
               <w:rPr>
                 <w:rStyle w:val="Hipervnculo"/>
@@ -6805,7 +6805,7 @@
                 <w:noProof/>
                 <w:webHidden/>
               </w:rPr>
-              <w:instrText xml:space="preserve"> PAGEREF _Toc242812850 \h </w:instrText>
+              <w:instrText xml:space="preserve"> PAGEREF _Toc243037717 \h </w:instrText>
             </w:r>
             <w:r>
               <w:rPr>
@@ -6825,7 +6825,7 @@
                 <w:noProof/>
                 <w:webHidden/>
               </w:rPr>
-              <w:t>25</w:t>
+              <w:t>26</w:t>
             </w:r>
             <w:r>
               <w:rPr>
@@ -6853,7 +6853,7 @@
               <w14:ligatures w14:val="standardContextual"/>
             </w:rPr>
           </w:pPr>
-          <w:hyperlink w:anchor="_Toc242812851" w:history="1">
+          <w:hyperlink w:anchor="_Toc243037718" w:history="1">
             <w:r>
               <w:rPr>
                 <w:rStyle w:val="Hipervnculo"/>
@@ -6881,7 +6881,7 @@
                 <w:noProof/>
                 <w:webHidden/>
               </w:rPr>
-              <w:instrText xml:space="preserve"> PAGEREF _Toc242812851 \h </w:instrText>
+              <w:instrText xml:space="preserve"> PAGEREF _Toc243037718 \h </w:instrText>
             </w:r>
             <w:r>
               <w:rPr>
@@ -6901,7 +6901,7 @@
                 <w:noProof/>
                 <w:webHidden/>
               </w:rPr>
-              <w:t>26</w:t>
+              <w:t>27</w:t>
             </w:r>
             <w:r>
               <w:rPr>
@@ -6927,7 +6927,7 @@
               <w14:ligatures w14:val="standardContextual"/>
             </w:rPr>
           </w:pPr>
-          <w:hyperlink w:anchor="_Toc242812852" w:history="1">
+          <w:hyperlink w:anchor="_Toc243037719" w:history="1">
             <w:r>
               <w:rPr>
                 <w:rStyle w:val="Hipervnculo"/>
@@ -6954,7 +6954,7 @@
                 <w:noProof/>
                 <w:webHidden/>
               </w:rPr>
-              <w:instrText xml:space="preserve"> PAGEREF _Toc242812852 \h </w:instrText>
+              <w:instrText xml:space="preserve"> PAGEREF _Toc243037719 \h </w:instrText>
             </w:r>
             <w:r>
               <w:rPr>
@@ -6974,7 +6974,7 @@
                 <w:noProof/>
                 <w:webHidden/>
               </w:rPr>
-              <w:t>26</w:t>
+              <w:t>27</w:t>
             </w:r>
             <w:r>
               <w:rPr>
@@ -7000,7 +7000,7 @@
               <w14:ligatures w14:val="standardContextual"/>
             </w:rPr>
           </w:pPr>
-          <w:hyperlink w:anchor="_Toc242812853" w:history="1">
+          <w:hyperlink w:anchor="_Toc243037720" w:history="1">
             <w:r>
               <w:rPr>
                 <w:rStyle w:val="Hipervnculo"/>
@@ -7027,7 +7027,7 @@
                 <w:noProof/>
                 <w:webHidden/>
               </w:rPr>
-              <w:instrText xml:space="preserve"> PAGEREF _Toc242812853 \h </w:instrText>
+              <w:instrText xml:space="preserve"> PAGEREF _Toc243037720 \h </w:instrText>
             </w:r>
             <w:r>
               <w:rPr>
@@ -7047,7 +7047,7 @@
                 <w:noProof/>
                 <w:webHidden/>
               </w:rPr>
-              <w:t>26</w:t>
+              <w:t>27</w:t>
             </w:r>
             <w:r>
               <w:rPr>
@@ -7073,7 +7073,7 @@
               <w14:ligatures w14:val="standardContextual"/>
             </w:rPr>
           </w:pPr>
-          <w:hyperlink w:anchor="_Toc242812854" w:history="1">
+          <w:hyperlink w:anchor="_Toc243037721" w:history="1">
             <w:r>
               <w:rPr>
                 <w:rStyle w:val="Hipervnculo"/>
@@ -7100,7 +7100,7 @@
                 <w:noProof/>
                 <w:webHidden/>
               </w:rPr>
-              <w:instrText xml:space="preserve"> PAGEREF _Toc242812854 \h </w:instrText>
+              <w:instrText xml:space="preserve"> PAGEREF _Toc243037721 \h </w:instrText>
             </w:r>
             <w:r>
               <w:rPr>
@@ -7120,7 +7120,7 @@
                 <w:noProof/>
                 <w:webHidden/>
               </w:rPr>
-              <w:t>26</w:t>
+              <w:t>27</w:t>
             </w:r>
             <w:r>
               <w:rPr>
@@ -7148,7 +7148,7 @@
               <w14:ligatures w14:val="standardContextual"/>
             </w:rPr>
           </w:pPr>
-          <w:hyperlink w:anchor="_Toc242812855" w:history="1">
+          <w:hyperlink w:anchor="_Toc243037722" w:history="1">
             <w:r>
               <w:rPr>
                 <w:rStyle w:val="Hipervnculo"/>
@@ -7176,7 +7176,7 @@
                 <w:noProof/>
                 <w:webHidden/>
               </w:rPr>
-              <w:instrText xml:space="preserve"> PAGEREF _Toc242812855 \h </w:instrText>
+              <w:instrText xml:space="preserve"> PAGEREF _Toc243037722 \h </w:instrText>
             </w:r>
             <w:r>
               <w:rPr>
@@ -7196,7 +7196,7 @@
                 <w:noProof/>
                 <w:webHidden/>
               </w:rPr>
-              <w:t>27</w:t>
+              <w:t>28</w:t>
             </w:r>
             <w:r>
               <w:rPr>
@@ -7222,7 +7222,7 @@
               <w14:ligatures w14:val="standardContextual"/>
             </w:rPr>
           </w:pPr>
-          <w:hyperlink w:anchor="_Toc242812856" w:history="1">
+          <w:hyperlink w:anchor="_Toc243037723" w:history="1">
             <w:r>
               <w:rPr>
                 <w:rStyle w:val="Hipervnculo"/>
@@ -7249,7 +7249,7 @@
                 <w:noProof/>
                 <w:webHidden/>
               </w:rPr>
-              <w:instrText xml:space="preserve"> PAGEREF _Toc242812856 \h </w:instrText>
+              <w:instrText xml:space="preserve"> PAGEREF _Toc243037723 \h </w:instrText>
             </w:r>
             <w:r>
               <w:rPr>
@@ -7269,7 +7269,7 @@
                 <w:noProof/>
                 <w:webHidden/>
               </w:rPr>
-              <w:t>27</w:t>
+              <w:t>28</w:t>
             </w:r>
             <w:r>
               <w:rPr>
@@ -7295,7 +7295,7 @@
               <w14:ligatures w14:val="standardContextual"/>
             </w:rPr>
           </w:pPr>
-          <w:hyperlink w:anchor="_Toc242812857" w:history="1">
+          <w:hyperlink w:anchor="_Toc243037724" w:history="1">
             <w:r>
               <w:rPr>
                 <w:rStyle w:val="Hipervnculo"/>
@@ -7322,7 +7322,7 @@
                 <w:noProof/>
                 <w:webHidden/>
               </w:rPr>
-              <w:instrText xml:space="preserve"> PAGEREF _Toc242812857 \h </w:instrText>
+              <w:instrText xml:space="preserve"> PAGEREF _Toc243037724 \h </w:instrText>
             </w:r>
             <w:r>
               <w:rPr>
@@ -7342,7 +7342,7 @@
                 <w:noProof/>
                 <w:webHidden/>
               </w:rPr>
-              <w:t>27</w:t>
+              <w:t>28</w:t>
             </w:r>
             <w:r>
               <w:rPr>
@@ -7368,7 +7368,7 @@
               <w14:ligatures w14:val="standardContextual"/>
             </w:rPr>
           </w:pPr>
-          <w:hyperlink w:anchor="_Toc242812858" w:history="1">
+          <w:hyperlink w:anchor="_Toc243037725" w:history="1">
             <w:r>
               <w:rPr>
                 <w:rStyle w:val="Hipervnculo"/>
@@ -7395,7 +7395,7 @@
                 <w:noProof/>
                 <w:webHidden/>
               </w:rPr>
-              <w:instrText xml:space="preserve"> PAGEREF _Toc242812858 \h </w:instrText>
+              <w:instrText xml:space="preserve"> PAGEREF _Toc243037725 \h </w:instrText>
             </w:r>
             <w:r>
               <w:rPr>
@@ -7415,7 +7415,7 @@
                 <w:noProof/>
                 <w:webHidden/>
               </w:rPr>
-              <w:t>27</w:t>
+              <w:t>28</w:t>
             </w:r>
             <w:r>
               <w:rPr>
@@ -7443,7 +7443,7 @@
               <w14:ligatures w14:val="standardContextual"/>
             </w:rPr>
           </w:pPr>
-          <w:hyperlink w:anchor="_Toc242812859" w:history="1">
+          <w:hyperlink w:anchor="_Toc243037726" w:history="1">
             <w:r>
               <w:rPr>
                 <w:rStyle w:val="Hipervnculo"/>
@@ -7471,7 +7471,7 @@
                 <w:noProof/>
                 <w:webHidden/>
               </w:rPr>
-              <w:instrText xml:space="preserve"> PAGEREF _Toc242812859 \h </w:instrText>
+              <w:instrText xml:space="preserve"> PAGEREF _Toc243037726 \h </w:instrText>
             </w:r>
             <w:r>
               <w:rPr>
@@ -7491,7 +7491,7 @@
                 <w:noProof/>
                 <w:webHidden/>
               </w:rPr>
-              <w:t>28</w:t>
+              <w:t>29</w:t>
             </w:r>
             <w:r>
               <w:rPr>
@@ -7517,7 +7517,7 @@
               <w14:ligatures w14:val="standardContextual"/>
             </w:rPr>
           </w:pPr>
-          <w:hyperlink w:anchor="_Toc242812860" w:history="1">
+          <w:hyperlink w:anchor="_Toc243037727" w:history="1">
             <w:r>
               <w:rPr>
                 <w:rStyle w:val="Hipervnculo"/>
@@ -7544,7 +7544,7 @@
                 <w:noProof/>
                 <w:webHidden/>
               </w:rPr>
-              <w:instrText xml:space="preserve"> PAGEREF _Toc242812860 \h </w:instrText>
+              <w:instrText xml:space="preserve"> PAGEREF _Toc243037727 \h </w:instrText>
             </w:r>
             <w:r>
               <w:rPr>
@@ -7564,7 +7564,7 @@
                 <w:noProof/>
                 <w:webHidden/>
               </w:rPr>
-              <w:t>28</w:t>
+              <w:t>29</w:t>
             </w:r>
             <w:r>
               <w:rPr>
@@ -7590,7 +7590,7 @@
               <w14:ligatures w14:val="standardContextual"/>
             </w:rPr>
           </w:pPr>
-          <w:hyperlink w:anchor="_Toc242812861" w:history="1">
+          <w:hyperlink w:anchor="_Toc243037728" w:history="1">
             <w:r>
               <w:rPr>
                 <w:rStyle w:val="Hipervnculo"/>
@@ -7617,7 +7617,7 @@
                 <w:noProof/>
                 <w:webHidden/>
               </w:rPr>
-              <w:instrText xml:space="preserve"> PAGEREF _Toc242812861 \h </w:instrText>
+              <w:instrText xml:space="preserve"> PAGEREF _Toc243037728 \h </w:instrText>
             </w:r>
             <w:r>
               <w:rPr>
@@ -7637,7 +7637,7 @@
                 <w:noProof/>
                 <w:webHidden/>
               </w:rPr>
-              <w:t>28</w:t>
+              <w:t>29</w:t>
             </w:r>
             <w:r>
               <w:rPr>
@@ -7663,7 +7663,7 @@
               <w14:ligatures w14:val="standardContextual"/>
             </w:rPr>
           </w:pPr>
-          <w:hyperlink w:anchor="_Toc242812862" w:history="1">
+          <w:hyperlink w:anchor="_Toc243037729" w:history="1">
             <w:r>
               <w:rPr>
                 <w:rStyle w:val="Hipervnculo"/>
@@ -7690,7 +7690,7 @@
                 <w:noProof/>
                 <w:webHidden/>
               </w:rPr>
-              <w:instrText xml:space="preserve"> PAGEREF _Toc242812862 \h </w:instrText>
+              <w:instrText xml:space="preserve"> PAGEREF _Toc243037729 \h </w:instrText>
             </w:r>
             <w:r>
               <w:rPr>
@@ -7710,7 +7710,7 @@
                 <w:noProof/>
                 <w:webHidden/>
               </w:rPr>
-              <w:t>28</w:t>
+              <w:t>29</w:t>
             </w:r>
             <w:r>
               <w:rPr>
@@ -7738,7 +7738,7 @@
               <w14:ligatures w14:val="standardContextual"/>
             </w:rPr>
           </w:pPr>
-          <w:hyperlink w:anchor="_Toc242812863" w:history="1">
+          <w:hyperlink w:anchor="_Toc243037730" w:history="1">
             <w:r>
               <w:rPr>
                 <w:rStyle w:val="Hipervnculo"/>
@@ -7766,7 +7766,7 @@
                 <w:noProof/>
                 <w:webHidden/>
               </w:rPr>
-              <w:instrText xml:space="preserve"> PAGEREF _Toc242812863 \h </w:instrText>
+              <w:instrText xml:space="preserve"> PAGEREF _Toc243037730 \h </w:instrText>
             </w:r>
             <w:r>
               <w:rPr>
@@ -7786,7 +7786,7 @@
                 <w:noProof/>
                 <w:webHidden/>
               </w:rPr>
-              <w:t>29</w:t>
+              <w:t>30</w:t>
             </w:r>
             <w:r>
               <w:rPr>
@@ -7812,7 +7812,7 @@
               <w14:ligatures w14:val="standardContextual"/>
             </w:rPr>
           </w:pPr>
-          <w:hyperlink w:anchor="_Toc242812864" w:history="1">
+          <w:hyperlink w:anchor="_Toc243037731" w:history="1">
             <w:r>
               <w:rPr>
                 <w:rStyle w:val="Hipervnculo"/>
@@ -7839,7 +7839,7 @@
                 <w:noProof/>
                 <w:webHidden/>
               </w:rPr>
-              <w:instrText xml:space="preserve"> PAGEREF _Toc242812864 \h </w:instrText>
+              <w:instrText xml:space="preserve"> PAGEREF _Toc243037731 \h </w:instrText>
             </w:r>
             <w:r>
               <w:rPr>
@@ -7859,7 +7859,7 @@
                 <w:noProof/>
                 <w:webHidden/>
               </w:rPr>
-              <w:t>29</w:t>
+              <w:t>30</w:t>
             </w:r>
             <w:r>
               <w:rPr>
@@ -7885,7 +7885,7 @@
               <w14:ligatures w14:val="standardContextual"/>
             </w:rPr>
           </w:pPr>
-          <w:hyperlink w:anchor="_Toc242812865" w:history="1">
+          <w:hyperlink w:anchor="_Toc243037732" w:history="1">
             <w:r>
               <w:rPr>
                 <w:rStyle w:val="Hipervnculo"/>
@@ -7912,7 +7912,7 @@
                 <w:noProof/>
                 <w:webHidden/>
               </w:rPr>
-              <w:instrText xml:space="preserve"> PAGEREF _Toc242812865 \h </w:instrText>
+              <w:instrText xml:space="preserve"> PAGEREF _Toc243037732 \h </w:instrText>
             </w:r>
             <w:r>
               <w:rPr>
@@ -7932,7 +7932,7 @@
                 <w:noProof/>
                 <w:webHidden/>
               </w:rPr>
-              <w:t>29</w:t>
+              <w:t>30</w:t>
             </w:r>
             <w:r>
               <w:rPr>
@@ -7958,7 +7958,7 @@
               <w14:ligatures w14:val="standardContextual"/>
             </w:rPr>
           </w:pPr>
-          <w:hyperlink w:anchor="_Toc242812866" w:history="1">
+          <w:hyperlink w:anchor="_Toc243037733" w:history="1">
             <w:r>
               <w:rPr>
                 <w:rStyle w:val="Hipervnculo"/>
@@ -7985,7 +7985,7 @@
                 <w:noProof/>
                 <w:webHidden/>
               </w:rPr>
-              <w:instrText xml:space="preserve"> PAGEREF _Toc242812866 \h </w:instrText>
+              <w:instrText xml:space="preserve"> PAGEREF _Toc243037733 \h </w:instrText>
             </w:r>
             <w:r>
               <w:rPr>
@@ -8005,7 +8005,7 @@
                 <w:noProof/>
                 <w:webHidden/>
               </w:rPr>
-              <w:t>29</w:t>
+              <w:t>30</w:t>
             </w:r>
             <w:r>
               <w:rPr>
@@ -8033,7 +8033,7 @@
               <w14:ligatures w14:val="standardContextual"/>
             </w:rPr>
           </w:pPr>
-          <w:hyperlink w:anchor="_Toc242812867" w:history="1">
+          <w:hyperlink w:anchor="_Toc243037734" w:history="1">
             <w:r>
               <w:rPr>
                 <w:rStyle w:val="Hipervnculo"/>
@@ -8061,7 +8061,7 @@
                 <w:noProof/>
                 <w:webHidden/>
               </w:rPr>
-              <w:instrText xml:space="preserve"> PAGEREF _Toc242812867 \h </w:instrText>
+              <w:instrText xml:space="preserve"> PAGEREF _Toc243037734 \h </w:instrText>
             </w:r>
             <w:r>
               <w:rPr>
@@ -8081,7 +8081,7 @@
                 <w:noProof/>
                 <w:webHidden/>
               </w:rPr>
-              <w:t>30</w:t>
+              <w:t>31</w:t>
             </w:r>
             <w:r>
               <w:rPr>
@@ -8118,7 +8118,7 @@
           <w:lang w:val="es-MX"/>
         </w:rPr>
       </w:pPr>
-      <w:bookmarkStart w:id="1" w:name="_Toc242812769"/>
+      <w:bookmarkStart w:id="1" w:name="_Toc243037636"/>
       <w:r>
         <w:rPr>
           <w:lang w:val="es-MX"/>
@@ -8179,7 +8179,7 @@
           <w:lang w:val="es-MX"/>
         </w:rPr>
       </w:pPr>
-      <w:bookmarkStart w:id="2" w:name="_Toc242812770"/>
+      <w:bookmarkStart w:id="2" w:name="_Toc243037637"/>
       <w:r>
         <w:rPr>
           <w:lang w:val="es-MX"/>
@@ -8210,7 +8210,21 @@
         <w:rPr>
           <w:lang w:val="es-MX"/>
         </w:rPr>
-        <w:t>. El frontend se comunica con una API REST, que aplica las reglas de negocio y accede a PostgreSQL.</w:t>
+        <w:t xml:space="preserve">. El </w:t>
+      </w:r>
+      <w:proofErr w:type="spellStart"/>
+      <w:r>
+        <w:rPr>
+          <w:lang w:val="es-MX"/>
+        </w:rPr>
+        <w:t>frontend</w:t>
+      </w:r>
+      <w:proofErr w:type="spellEnd"/>
+      <w:r>
+        <w:rPr>
+          <w:lang w:val="es-MX"/>
+        </w:rPr>
+        <w:t xml:space="preserve"> se comunica con una API REST, que aplica las reglas de negocio y accede a PostgreSQL.</w:t>
       </w:r>
     </w:p>
     <w:p>
@@ -8551,12 +8565,14 @@
                 <w:lang w:val="es-MX"/>
               </w:rPr>
             </w:pPr>
+            <w:proofErr w:type="spellStart"/>
             <w:r>
               <w:rPr>
                 <w:lang w:val="es-MX"/>
               </w:rPr>
               <w:t>Dashboard</w:t>
             </w:r>
+            <w:proofErr w:type="spellEnd"/>
           </w:p>
         </w:tc>
         <w:tc>
@@ -8675,7 +8691,7 @@
           <w:lang w:val="es-MX"/>
         </w:rPr>
       </w:pPr>
-      <w:bookmarkStart w:id="3" w:name="_Toc242812771"/>
+      <w:bookmarkStart w:id="3" w:name="_Toc243037638"/>
       <w:r>
         <w:rPr>
           <w:lang w:val="es-MX"/>
@@ -8807,7 +8823,7 @@
           <w:lang w:val="es-MX"/>
         </w:rPr>
       </w:pPr>
-      <w:bookmarkStart w:id="4" w:name="_Toc242812772"/>
+      <w:bookmarkStart w:id="4" w:name="_Toc243037639"/>
       <w:r>
         <w:rPr>
           <w:lang w:val="es-MX"/>
@@ -9133,7 +9149,7 @@
           <w:lang w:val="es-MX"/>
         </w:rPr>
       </w:pPr>
-      <w:bookmarkStart w:id="5" w:name="_Toc242812773"/>
+      <w:bookmarkStart w:id="5" w:name="_Toc243037640"/>
       <w:r>
         <w:rPr>
           <w:lang w:val="es-MX"/>
@@ -9232,7 +9248,21 @@
         <w:rPr>
           <w:lang w:val="es-MX"/>
         </w:rPr>
-        <w:t>Nota de modelado: este es un diagrama funcional de alto nivel. Los actores asignados a cada caso son preliminares cuando la documentación no identifica explícitamente el rol autorizado. En particular, las relaciones con el proveedor y el reloj son representaciones conceptuales. Los permisos definitivos deben verificarse en las rutas y servicios del backend.</w:t>
+        <w:t xml:space="preserve">Nota de modelado: este es un diagrama funcional de alto nivel. Los actores asignados a cada caso son preliminares cuando la documentación no identifica explícitamente el rol autorizado. En particular, las relaciones con el proveedor y el reloj son representaciones conceptuales. Los permisos definitivos deben verificarse en las rutas y servicios del </w:t>
+      </w:r>
+      <w:proofErr w:type="spellStart"/>
+      <w:r>
+        <w:rPr>
+          <w:lang w:val="es-MX"/>
+        </w:rPr>
+        <w:t>backend</w:t>
+      </w:r>
+      <w:proofErr w:type="spellEnd"/>
+      <w:r>
+        <w:rPr>
+          <w:lang w:val="es-MX"/>
+        </w:rPr>
+        <w:t>.</w:t>
       </w:r>
     </w:p>
     <w:p>
@@ -9354,7 +9384,7 @@
           <w:lang w:val="es-MX"/>
         </w:rPr>
       </w:pPr>
-      <w:bookmarkStart w:id="6" w:name="_Toc242812774"/>
+      <w:bookmarkStart w:id="6" w:name="_Toc243037641"/>
       <w:r>
         <w:rPr>
           <w:lang w:val="es-MX"/>
@@ -10602,8 +10632,16 @@
               <w:rPr>
                 <w:lang w:val="es-MX"/>
               </w:rPr>
-              <w:t>Consultar dashboard</w:t>
-            </w:r>
+              <w:t xml:space="preserve">Consultar </w:t>
+            </w:r>
+            <w:proofErr w:type="spellStart"/>
+            <w:r>
+              <w:rPr>
+                <w:lang w:val="es-MX"/>
+              </w:rPr>
+              <w:t>dashboard</w:t>
+            </w:r>
+            <w:proofErr w:type="spellEnd"/>
           </w:p>
         </w:tc>
         <w:tc>
@@ -10836,7 +10874,7 @@
           <w:lang w:val="es-MX"/>
         </w:rPr>
       </w:pPr>
-      <w:bookmarkStart w:id="7" w:name="_Toc242812775"/>
+      <w:bookmarkStart w:id="7" w:name="_Toc243037642"/>
       <w:r>
         <w:rPr>
           <w:lang w:val="es-MX"/>
@@ -10853,7 +10891,7 @@
           <w:lang w:val="es-MX"/>
         </w:rPr>
       </w:pPr>
-      <w:bookmarkStart w:id="8" w:name="_Toc242812776"/>
+      <w:bookmarkStart w:id="8" w:name="_Toc243037643"/>
       <w:r>
         <w:rPr>
           <w:lang w:val="es-MX"/>
@@ -11238,7 +11276,7 @@
           <w:lang w:val="es-MX"/>
         </w:rPr>
       </w:pPr>
-      <w:bookmarkStart w:id="9" w:name="_Toc242812777"/>
+      <w:bookmarkStart w:id="9" w:name="_Toc243037644"/>
       <w:r>
         <w:rPr>
           <w:lang w:val="es-MX"/>
@@ -11295,7 +11333,35 @@
         <w:rPr>
           <w:lang w:val="es-MX"/>
         </w:rPr>
-        <w:t>El frontend envía la solicitud al backend.</w:t>
+        <w:t xml:space="preserve">El </w:t>
+      </w:r>
+      <w:proofErr w:type="spellStart"/>
+      <w:r>
+        <w:rPr>
+          <w:lang w:val="es-MX"/>
+        </w:rPr>
+        <w:t>frontend</w:t>
+      </w:r>
+      <w:proofErr w:type="spellEnd"/>
+      <w:r>
+        <w:rPr>
+          <w:lang w:val="es-MX"/>
+        </w:rPr>
+        <w:t xml:space="preserve"> envía la solicitud al </w:t>
+      </w:r>
+      <w:proofErr w:type="spellStart"/>
+      <w:r>
+        <w:rPr>
+          <w:lang w:val="es-MX"/>
+        </w:rPr>
+        <w:t>backend</w:t>
+      </w:r>
+      <w:proofErr w:type="spellEnd"/>
+      <w:r>
+        <w:rPr>
+          <w:lang w:val="es-MX"/>
+        </w:rPr>
+        <w:t>.</w:t>
       </w:r>
     </w:p>
     <w:p>
@@ -11312,7 +11378,21 @@
         <w:rPr>
           <w:lang w:val="es-MX"/>
         </w:rPr>
-        <w:t>El backend valida las credenciales.</w:t>
+        <w:t xml:space="preserve">El </w:t>
+      </w:r>
+      <w:proofErr w:type="spellStart"/>
+      <w:r>
+        <w:rPr>
+          <w:lang w:val="es-MX"/>
+        </w:rPr>
+        <w:t>backend</w:t>
+      </w:r>
+      <w:proofErr w:type="spellEnd"/>
+      <w:r>
+        <w:rPr>
+          <w:lang w:val="es-MX"/>
+        </w:rPr>
+        <w:t xml:space="preserve"> valida las credenciales.</w:t>
       </w:r>
     </w:p>
     <w:p>
@@ -11346,7 +11426,21 @@
         <w:rPr>
           <w:lang w:val="es-MX"/>
         </w:rPr>
-        <w:t>Se establece la sesión mediante una cookie JWT HttpOnly.</w:t>
+        <w:t xml:space="preserve">Se establece la sesión mediante una cookie JWT </w:t>
+      </w:r>
+      <w:proofErr w:type="spellStart"/>
+      <w:r>
+        <w:rPr>
+          <w:lang w:val="es-MX"/>
+        </w:rPr>
+        <w:t>HttpOnly</w:t>
+      </w:r>
+      <w:proofErr w:type="spellEnd"/>
+      <w:r>
+        <w:rPr>
+          <w:lang w:val="es-MX"/>
+        </w:rPr>
+        <w:t>.</w:t>
       </w:r>
     </w:p>
     <w:p>
@@ -11373,7 +11467,7 @@
           <w:lang w:val="es-MX"/>
         </w:rPr>
       </w:pPr>
-      <w:bookmarkStart w:id="10" w:name="_Toc242812778"/>
+      <w:bookmarkStart w:id="10" w:name="_Toc243037645"/>
       <w:r>
         <w:rPr>
           <w:lang w:val="es-MX"/>
@@ -11457,7 +11551,7 @@
           <w:lang w:val="es-MX"/>
         </w:rPr>
       </w:pPr>
-      <w:bookmarkStart w:id="11" w:name="_Toc242812779"/>
+      <w:bookmarkStart w:id="11" w:name="_Toc243037646"/>
       <w:r>
         <w:rPr>
           <w:lang w:val="es-MX"/>
@@ -11497,7 +11591,21 @@
         <w:rPr>
           <w:lang w:val="es-MX"/>
         </w:rPr>
-        <w:t>El control de permisos se aplica en el backend; no debe modelarse como una simple restricción visual.</w:t>
+        <w:t xml:space="preserve">El control de permisos se aplica en el </w:t>
+      </w:r>
+      <w:proofErr w:type="spellStart"/>
+      <w:r>
+        <w:rPr>
+          <w:lang w:val="es-MX"/>
+        </w:rPr>
+        <w:t>backend</w:t>
+      </w:r>
+      <w:proofErr w:type="spellEnd"/>
+      <w:r>
+        <w:rPr>
+          <w:lang w:val="es-MX"/>
+        </w:rPr>
+        <w:t>; no debe modelarse como una simple restricción visual.</w:t>
       </w:r>
     </w:p>
     <w:p>
@@ -11514,7 +11622,7 @@
           <w:lang w:val="es-MX"/>
         </w:rPr>
       </w:pPr>
-      <w:bookmarkStart w:id="12" w:name="_Toc242812780"/>
+      <w:bookmarkStart w:id="12" w:name="_Toc243037647"/>
       <w:r>
         <w:rPr>
           <w:lang w:val="es-MX"/>
@@ -11802,7 +11910,7 @@
           <w:lang w:val="es-MX"/>
         </w:rPr>
       </w:pPr>
-      <w:bookmarkStart w:id="13" w:name="_Toc242812781"/>
+      <w:bookmarkStart w:id="13" w:name="_Toc243037648"/>
       <w:r>
         <w:rPr>
           <w:lang w:val="es-MX"/>
@@ -11893,7 +12001,21 @@
         <w:rPr>
           <w:lang w:val="es-MX"/>
         </w:rPr>
-        <w:t>El backend verifica la autorización.</w:t>
+        <w:t xml:space="preserve">El </w:t>
+      </w:r>
+      <w:proofErr w:type="spellStart"/>
+      <w:r>
+        <w:rPr>
+          <w:lang w:val="es-MX"/>
+        </w:rPr>
+        <w:t>backend</w:t>
+      </w:r>
+      <w:proofErr w:type="spellEnd"/>
+      <w:r>
+        <w:rPr>
+          <w:lang w:val="es-MX"/>
+        </w:rPr>
+        <w:t xml:space="preserve"> verifica la autorización.</w:t>
       </w:r>
     </w:p>
     <w:p>
@@ -11937,7 +12059,7 @@
           <w:lang w:val="es-MX"/>
         </w:rPr>
       </w:pPr>
-      <w:bookmarkStart w:id="14" w:name="_Toc242812782"/>
+      <w:bookmarkStart w:id="14" w:name="_Toc243037649"/>
       <w:r>
         <w:rPr>
           <w:lang w:val="es-MX"/>
@@ -11977,7 +12099,21 @@
         <w:rPr>
           <w:lang w:val="es-MX"/>
         </w:rPr>
-        <w:t>A2. Permisos insuficientes: el backend deniega la operación.</w:t>
+        <w:t xml:space="preserve">A2. Permisos insuficientes: el </w:t>
+      </w:r>
+      <w:proofErr w:type="spellStart"/>
+      <w:r>
+        <w:rPr>
+          <w:lang w:val="es-MX"/>
+        </w:rPr>
+        <w:t>backend</w:t>
+      </w:r>
+      <w:proofErr w:type="spellEnd"/>
+      <w:r>
+        <w:rPr>
+          <w:lang w:val="es-MX"/>
+        </w:rPr>
+        <w:t xml:space="preserve"> deniega la operación.</w:t>
       </w:r>
     </w:p>
     <w:p>
@@ -12011,7 +12147,21 @@
         <w:rPr>
           <w:lang w:val="es-MX"/>
         </w:rPr>
-        <w:t>A4. Intento de asignar una combinación no permitida: debe rechazarse conforme a las reglas definidas en el backend.</w:t>
+        <w:t xml:space="preserve">A4. Intento de asignar una combinación no permitida: debe rechazarse conforme a las reglas definidas en el </w:t>
+      </w:r>
+      <w:proofErr w:type="spellStart"/>
+      <w:r>
+        <w:rPr>
+          <w:lang w:val="es-MX"/>
+        </w:rPr>
+        <w:t>backend</w:t>
+      </w:r>
+      <w:proofErr w:type="spellEnd"/>
+      <w:r>
+        <w:rPr>
+          <w:lang w:val="es-MX"/>
+        </w:rPr>
+        <w:t>.</w:t>
       </w:r>
     </w:p>
     <w:p>
@@ -12021,7 +12171,7 @@
           <w:lang w:val="es-MX"/>
         </w:rPr>
       </w:pPr>
-      <w:bookmarkStart w:id="15" w:name="_Toc242812783"/>
+      <w:bookmarkStart w:id="15" w:name="_Toc243037650"/>
       <w:r>
         <w:rPr>
           <w:lang w:val="es-MX"/>
@@ -12084,7 +12234,7 @@
           <w:lang w:val="es-MX"/>
         </w:rPr>
       </w:pPr>
-      <w:bookmarkStart w:id="16" w:name="_Toc242812784"/>
+      <w:bookmarkStart w:id="16" w:name="_Toc243037651"/>
       <w:r>
         <w:rPr>
           <w:lang w:val="es-MX"/>
@@ -12372,7 +12522,7 @@
           <w:lang w:val="es-MX"/>
         </w:rPr>
       </w:pPr>
-      <w:bookmarkStart w:id="17" w:name="_Toc242812785"/>
+      <w:bookmarkStart w:id="17" w:name="_Toc243037652"/>
       <w:r>
         <w:rPr>
           <w:lang w:val="es-MX"/>
@@ -12463,7 +12613,21 @@
         <w:rPr>
           <w:lang w:val="es-MX"/>
         </w:rPr>
-        <w:t>El backend guarda los cambios autorizados.</w:t>
+        <w:t xml:space="preserve">El </w:t>
+      </w:r>
+      <w:proofErr w:type="spellStart"/>
+      <w:r>
+        <w:rPr>
+          <w:lang w:val="es-MX"/>
+        </w:rPr>
+        <w:t>backend</w:t>
+      </w:r>
+      <w:proofErr w:type="spellEnd"/>
+      <w:r>
+        <w:rPr>
+          <w:lang w:val="es-MX"/>
+        </w:rPr>
+        <w:t xml:space="preserve"> guarda los cambios autorizados.</w:t>
       </w:r>
     </w:p>
     <w:p>
@@ -12480,7 +12644,21 @@
         <w:rPr>
           <w:lang w:val="es-MX"/>
         </w:rPr>
-        <w:t>El frontend refleja los valores actualizados.</w:t>
+        <w:t xml:space="preserve">El </w:t>
+      </w:r>
+      <w:proofErr w:type="spellStart"/>
+      <w:r>
+        <w:rPr>
+          <w:lang w:val="es-MX"/>
+        </w:rPr>
+        <w:t>frontend</w:t>
+      </w:r>
+      <w:proofErr w:type="spellEnd"/>
+      <w:r>
+        <w:rPr>
+          <w:lang w:val="es-MX"/>
+        </w:rPr>
+        <w:t xml:space="preserve"> refleja los valores actualizados.</w:t>
       </w:r>
     </w:p>
     <w:p>
@@ -12490,7 +12668,7 @@
           <w:lang w:val="es-MX"/>
         </w:rPr>
       </w:pPr>
-      <w:bookmarkStart w:id="18" w:name="_Toc242812786"/>
+      <w:bookmarkStart w:id="18" w:name="_Toc243037653"/>
       <w:r>
         <w:rPr>
           <w:lang w:val="es-MX"/>
@@ -12557,7 +12735,7 @@
           <w:lang w:val="es-MX"/>
         </w:rPr>
       </w:pPr>
-      <w:bookmarkStart w:id="19" w:name="_Toc242812787"/>
+      <w:bookmarkStart w:id="19" w:name="_Toc243037654"/>
       <w:r>
         <w:rPr>
           <w:lang w:val="es-MX"/>
@@ -12642,7 +12820,7 @@
           <w:lang w:val="es-MX"/>
         </w:rPr>
       </w:pPr>
-      <w:bookmarkStart w:id="20" w:name="_Toc242812788"/>
+      <w:bookmarkStart w:id="20" w:name="_Toc243037655"/>
       <w:r>
         <w:rPr>
           <w:lang w:val="es-MX"/>
@@ -13028,7 +13206,7 @@
           <w:lang w:val="es-MX"/>
         </w:rPr>
       </w:pPr>
-      <w:bookmarkStart w:id="21" w:name="_Toc242812789"/>
+      <w:bookmarkStart w:id="21" w:name="_Toc243037656"/>
       <w:r>
         <w:rPr>
           <w:lang w:val="es-MX"/>
@@ -13188,7 +13366,25 @@
           <w:szCs w:val="20"/>
           <w:lang w:val="es-MX"/>
         </w:rPr>
-        <w:t>El backend registra la orden y su detalle.</w:t>
+        <w:t xml:space="preserve">El </w:t>
+      </w:r>
+      <w:proofErr w:type="spellStart"/>
+      <w:r>
+        <w:rPr>
+          <w:sz w:val="20"/>
+          <w:szCs w:val="20"/>
+          <w:lang w:val="es-MX"/>
+        </w:rPr>
+        <w:t>backend</w:t>
+      </w:r>
+      <w:proofErr w:type="spellEnd"/>
+      <w:r>
+        <w:rPr>
+          <w:sz w:val="20"/>
+          <w:szCs w:val="20"/>
+          <w:lang w:val="es-MX"/>
+        </w:rPr>
+        <w:t xml:space="preserve"> registra la orden y su detalle.</w:t>
       </w:r>
     </w:p>
     <w:p>
@@ -13220,7 +13416,7 @@
           <w:lang w:val="es-MX"/>
         </w:rPr>
       </w:pPr>
-      <w:bookmarkStart w:id="22" w:name="_Toc242812790"/>
+      <w:bookmarkStart w:id="22" w:name="_Toc243037657"/>
       <w:r>
         <w:rPr>
           <w:lang w:val="es-MX"/>
@@ -13341,7 +13537,7 @@
           <w:lang w:val="es-MX"/>
         </w:rPr>
       </w:pPr>
-      <w:bookmarkStart w:id="23" w:name="_Toc242812791"/>
+      <w:bookmarkStart w:id="23" w:name="_Toc243037658"/>
       <w:r>
         <w:rPr>
           <w:lang w:val="es-MX"/>
@@ -13364,7 +13560,21 @@
         <w:rPr>
           <w:lang w:val="es-MX"/>
         </w:rPr>
-        <w:t>&lt;&lt;include&gt;&gt; CU-05, Procesar pago, cuando el flujo de venta requiere cobrar.</w:t>
+        <w:t>&lt;&lt;</w:t>
+      </w:r>
+      <w:proofErr w:type="spellStart"/>
+      <w:r>
+        <w:rPr>
+          <w:lang w:val="es-MX"/>
+        </w:rPr>
+        <w:t>include</w:t>
+      </w:r>
+      <w:proofErr w:type="spellEnd"/>
+      <w:r>
+        <w:rPr>
+          <w:lang w:val="es-MX"/>
+        </w:rPr>
+        <w:t>&gt;&gt; CU-05, Procesar pago, cuando el flujo de venta requiere cobrar.</w:t>
       </w:r>
     </w:p>
     <w:p>
@@ -13388,7 +13598,7 @@
           <w:lang w:val="es-MX"/>
         </w:rPr>
       </w:pPr>
-      <w:bookmarkStart w:id="24" w:name="_Toc242812792"/>
+      <w:bookmarkStart w:id="24" w:name="_Toc243037659"/>
       <w:r>
         <w:rPr>
           <w:lang w:val="es-MX"/>
@@ -13676,7 +13886,7 @@
           <w:lang w:val="es-MX"/>
         </w:rPr>
       </w:pPr>
-      <w:bookmarkStart w:id="25" w:name="_Toc242812793"/>
+      <w:bookmarkStart w:id="25" w:name="_Toc243037660"/>
       <w:r>
         <w:rPr>
           <w:lang w:val="es-MX"/>
@@ -13750,7 +13960,21 @@
         <w:rPr>
           <w:lang w:val="es-MX"/>
         </w:rPr>
-        <w:t>El backend registra el pago.</w:t>
+        <w:t xml:space="preserve">El </w:t>
+      </w:r>
+      <w:proofErr w:type="spellStart"/>
+      <w:r>
+        <w:rPr>
+          <w:lang w:val="es-MX"/>
+        </w:rPr>
+        <w:t>backend</w:t>
+      </w:r>
+      <w:proofErr w:type="spellEnd"/>
+      <w:r>
+        <w:rPr>
+          <w:lang w:val="es-MX"/>
+        </w:rPr>
+        <w:t xml:space="preserve"> registra el pago.</w:t>
       </w:r>
     </w:p>
     <w:p>
@@ -13811,7 +14035,7 @@
           <w:lang w:val="es-MX"/>
         </w:rPr>
       </w:pPr>
-      <w:bookmarkStart w:id="26" w:name="_Toc242812794"/>
+      <w:bookmarkStart w:id="26" w:name="_Toc243037661"/>
       <w:r>
         <w:rPr>
           <w:lang w:val="es-MX"/>
@@ -13895,7 +14119,7 @@
           <w:lang w:val="es-MX"/>
         </w:rPr>
       </w:pPr>
-      <w:bookmarkStart w:id="27" w:name="_Toc242812795"/>
+      <w:bookmarkStart w:id="27" w:name="_Toc243037662"/>
       <w:r>
         <w:rPr>
           <w:lang w:val="es-MX"/>
@@ -13966,7 +14190,7 @@
           <w:lang w:val="es-MX"/>
         </w:rPr>
       </w:pPr>
-      <w:bookmarkStart w:id="28" w:name="_Toc242812796"/>
+      <w:bookmarkStart w:id="28" w:name="_Toc243037663"/>
       <w:r>
         <w:rPr>
           <w:lang w:val="es-MX"/>
@@ -14254,7 +14478,7 @@
           <w:lang w:val="es-MX"/>
         </w:rPr>
       </w:pPr>
-      <w:bookmarkStart w:id="29" w:name="_Toc242812797"/>
+      <w:bookmarkStart w:id="29" w:name="_Toc243037664"/>
       <w:r>
         <w:rPr>
           <w:lang w:val="es-MX"/>
@@ -14415,7 +14639,7 @@
           <w:lang w:val="es-MX"/>
         </w:rPr>
       </w:pPr>
-      <w:bookmarkStart w:id="30" w:name="_Toc242812798"/>
+      <w:bookmarkStart w:id="30" w:name="_Toc243037665"/>
       <w:r>
         <w:rPr>
           <w:lang w:val="es-MX"/>
@@ -14499,7 +14723,7 @@
           <w:lang w:val="es-MX"/>
         </w:rPr>
       </w:pPr>
-      <w:bookmarkStart w:id="31" w:name="_Toc242812799"/>
+      <w:bookmarkStart w:id="31" w:name="_Toc243037666"/>
       <w:r>
         <w:rPr>
           <w:lang w:val="es-MX"/>
@@ -14522,7 +14746,21 @@
         <w:rPr>
           <w:lang w:val="es-MX"/>
         </w:rPr>
-        <w:t>&lt;&lt;extend&gt;&gt; CU-07, Cancelar orden, cuando se cumple la condición de cancelación.</w:t>
+        <w:t>&lt;&lt;</w:t>
+      </w:r>
+      <w:proofErr w:type="spellStart"/>
+      <w:r>
+        <w:rPr>
+          <w:lang w:val="es-MX"/>
+        </w:rPr>
+        <w:t>extend</w:t>
+      </w:r>
+      <w:proofErr w:type="spellEnd"/>
+      <w:r>
+        <w:rPr>
+          <w:lang w:val="es-MX"/>
+        </w:rPr>
+        <w:t>&gt;&gt; CU-07, Cancelar orden, cuando se cumple la condición de cancelación.</w:t>
       </w:r>
     </w:p>
     <w:p>
@@ -14532,7 +14770,7 @@
           <w:lang w:val="es-MX"/>
         </w:rPr>
       </w:pPr>
-      <w:bookmarkStart w:id="32" w:name="_Toc242812800"/>
+      <w:bookmarkStart w:id="32" w:name="_Toc243037667"/>
       <w:r>
         <w:rPr>
           <w:lang w:val="es-MX"/>
@@ -14573,7 +14811,7 @@
           <w:lang w:val="es-MX"/>
         </w:rPr>
       </w:pPr>
-      <w:bookmarkStart w:id="33" w:name="_Toc242812801"/>
+      <w:bookmarkStart w:id="33" w:name="_Toc243037668"/>
       <w:r>
         <w:rPr>
           <w:lang w:val="es-MX"/>
@@ -14861,7 +15099,7 @@
           <w:lang w:val="es-MX"/>
         </w:rPr>
       </w:pPr>
-      <w:bookmarkStart w:id="34" w:name="_Toc242812802"/>
+      <w:bookmarkStart w:id="34" w:name="_Toc243037669"/>
       <w:r>
         <w:rPr>
           <w:lang w:val="es-MX"/>
@@ -14935,7 +15173,21 @@
         <w:rPr>
           <w:lang w:val="es-MX"/>
         </w:rPr>
-        <w:t>El backend determina los movimientos que deben revertirse.</w:t>
+        <w:t xml:space="preserve">El </w:t>
+      </w:r>
+      <w:proofErr w:type="spellStart"/>
+      <w:r>
+        <w:rPr>
+          <w:lang w:val="es-MX"/>
+        </w:rPr>
+        <w:t>backend</w:t>
+      </w:r>
+      <w:proofErr w:type="spellEnd"/>
+      <w:r>
+        <w:rPr>
+          <w:lang w:val="es-MX"/>
+        </w:rPr>
+        <w:t xml:space="preserve"> determina los movimientos que deben revertirse.</w:t>
       </w:r>
     </w:p>
     <w:p>
@@ -14996,7 +15248,7 @@
           <w:lang w:val="es-MX"/>
         </w:rPr>
       </w:pPr>
-      <w:bookmarkStart w:id="35" w:name="_Toc242812803"/>
+      <w:bookmarkStart w:id="35" w:name="_Toc243037670"/>
       <w:r>
         <w:rPr>
           <w:lang w:val="es-MX"/>
@@ -15080,7 +15332,7 @@
           <w:lang w:val="es-MX"/>
         </w:rPr>
       </w:pPr>
-      <w:bookmarkStart w:id="36" w:name="_Toc242812804"/>
+      <w:bookmarkStart w:id="36" w:name="_Toc243037671"/>
       <w:r>
         <w:rPr>
           <w:lang w:val="es-MX"/>
@@ -15103,7 +15355,21 @@
         <w:rPr>
           <w:lang w:val="es-MX"/>
         </w:rPr>
-        <w:t>&lt;&lt;extend&gt;&gt; CU-06, Gestionar órdenes del día.</w:t>
+        <w:t>&lt;&lt;</w:t>
+      </w:r>
+      <w:proofErr w:type="spellStart"/>
+      <w:r>
+        <w:rPr>
+          <w:lang w:val="es-MX"/>
+        </w:rPr>
+        <w:t>extend</w:t>
+      </w:r>
+      <w:proofErr w:type="spellEnd"/>
+      <w:r>
+        <w:rPr>
+          <w:lang w:val="es-MX"/>
+        </w:rPr>
+        <w:t>&gt;&gt; CU-06, Gestionar órdenes del día.</w:t>
       </w:r>
     </w:p>
     <w:p>
@@ -15161,7 +15427,7 @@
           <w:lang w:val="es-MX"/>
         </w:rPr>
       </w:pPr>
-      <w:bookmarkStart w:id="37" w:name="_Toc242812805"/>
+      <w:bookmarkStart w:id="37" w:name="_Toc243037672"/>
       <w:r>
         <w:rPr>
           <w:lang w:val="es-MX"/>
@@ -15449,7 +15715,7 @@
           <w:lang w:val="es-MX"/>
         </w:rPr>
       </w:pPr>
-      <w:bookmarkStart w:id="38" w:name="_Toc242812806"/>
+      <w:bookmarkStart w:id="38" w:name="_Toc243037673"/>
       <w:r>
         <w:rPr>
           <w:lang w:val="es-MX"/>
@@ -15557,7 +15823,21 @@
         <w:rPr>
           <w:lang w:val="es-MX"/>
         </w:rPr>
-        <w:t>El backend persiste el cambio.</w:t>
+        <w:t xml:space="preserve">El </w:t>
+      </w:r>
+      <w:proofErr w:type="spellStart"/>
+      <w:r>
+        <w:rPr>
+          <w:lang w:val="es-MX"/>
+        </w:rPr>
+        <w:t>backend</w:t>
+      </w:r>
+      <w:proofErr w:type="spellEnd"/>
+      <w:r>
+        <w:rPr>
+          <w:lang w:val="es-MX"/>
+        </w:rPr>
+        <w:t xml:space="preserve"> persiste el cambio.</w:t>
       </w:r>
     </w:p>
     <w:p>
@@ -15584,7 +15864,7 @@
           <w:lang w:val="es-MX"/>
         </w:rPr>
       </w:pPr>
-      <w:bookmarkStart w:id="39" w:name="_Toc242812807"/>
+      <w:bookmarkStart w:id="39" w:name="_Toc243037674"/>
       <w:r>
         <w:rPr>
           <w:lang w:val="es-MX"/>
@@ -15624,7 +15904,21 @@
         <w:rPr>
           <w:lang w:val="es-MX"/>
         </w:rPr>
-        <w:t>Imágenes de productos mediante Supabase Storage.</w:t>
+        <w:t xml:space="preserve">Imágenes de productos mediante </w:t>
+      </w:r>
+      <w:proofErr w:type="spellStart"/>
+      <w:r>
+        <w:rPr>
+          <w:lang w:val="es-MX"/>
+        </w:rPr>
+        <w:t>Supabase</w:t>
+      </w:r>
+      <w:proofErr w:type="spellEnd"/>
+      <w:r>
+        <w:rPr>
+          <w:lang w:val="es-MX"/>
+        </w:rPr>
+        <w:t xml:space="preserve"> Storage.</w:t>
       </w:r>
     </w:p>
     <w:p>
@@ -15668,7 +15962,7 @@
           <w:lang w:val="es-MX"/>
         </w:rPr>
       </w:pPr>
-      <w:bookmarkStart w:id="40" w:name="_Toc242812808"/>
+      <w:bookmarkStart w:id="40" w:name="_Toc243037675"/>
       <w:r>
         <w:rPr>
           <w:lang w:val="es-MX"/>
@@ -15752,7 +16046,7 @@
           <w:lang w:val="es-MX"/>
         </w:rPr>
       </w:pPr>
-      <w:bookmarkStart w:id="41" w:name="_Toc242812809"/>
+      <w:bookmarkStart w:id="41" w:name="_Toc243037676"/>
       <w:r>
         <w:rPr>
           <w:lang w:val="es-MX"/>
@@ -15802,7 +16096,7 @@
           <w:lang w:val="es-MX"/>
         </w:rPr>
       </w:pPr>
-      <w:bookmarkStart w:id="42" w:name="_Toc242812810"/>
+      <w:bookmarkStart w:id="42" w:name="_Toc243037677"/>
       <w:r>
         <w:rPr>
           <w:lang w:val="es-MX"/>
@@ -16090,7 +16384,7 @@
           <w:lang w:val="es-MX"/>
         </w:rPr>
       </w:pPr>
-      <w:bookmarkStart w:id="43" w:name="_Toc242812811"/>
+      <w:bookmarkStart w:id="43" w:name="_Toc243037678"/>
       <w:r>
         <w:rPr>
           <w:lang w:val="es-MX"/>
@@ -16181,7 +16475,21 @@
         <w:rPr>
           <w:lang w:val="es-MX"/>
         </w:rPr>
-        <w:t>El backend registra la sesión.</w:t>
+        <w:t xml:space="preserve">El </w:t>
+      </w:r>
+      <w:proofErr w:type="spellStart"/>
+      <w:r>
+        <w:rPr>
+          <w:lang w:val="es-MX"/>
+        </w:rPr>
+        <w:t>backend</w:t>
+      </w:r>
+      <w:proofErr w:type="spellEnd"/>
+      <w:r>
+        <w:rPr>
+          <w:lang w:val="es-MX"/>
+        </w:rPr>
+        <w:t xml:space="preserve"> registra la sesión.</w:t>
       </w:r>
     </w:p>
     <w:p>
@@ -16208,7 +16516,7 @@
           <w:lang w:val="es-MX"/>
         </w:rPr>
       </w:pPr>
-      <w:bookmarkStart w:id="44" w:name="_Toc242812812"/>
+      <w:bookmarkStart w:id="44" w:name="_Toc243037679"/>
       <w:r>
         <w:rPr>
           <w:lang w:val="es-MX"/>
@@ -16292,7 +16600,7 @@
           <w:lang w:val="es-MX"/>
         </w:rPr>
       </w:pPr>
-      <w:bookmarkStart w:id="45" w:name="_Toc242812813"/>
+      <w:bookmarkStart w:id="45" w:name="_Toc243037680"/>
       <w:r>
         <w:rPr>
           <w:lang w:val="es-MX"/>
@@ -16377,7 +16685,7 @@
           <w:lang w:val="es-MX"/>
         </w:rPr>
       </w:pPr>
-      <w:bookmarkStart w:id="46" w:name="_Toc242812814"/>
+      <w:bookmarkStart w:id="46" w:name="_Toc243037681"/>
       <w:r>
         <w:rPr>
           <w:lang w:val="es-MX"/>
@@ -16665,7 +16973,7 @@
           <w:lang w:val="es-MX"/>
         </w:rPr>
       </w:pPr>
-      <w:bookmarkStart w:id="47" w:name="_Toc242812815"/>
+      <w:bookmarkStart w:id="47" w:name="_Toc243037682"/>
       <w:r>
         <w:rPr>
           <w:lang w:val="es-MX"/>
@@ -16773,7 +17081,21 @@
         <w:rPr>
           <w:lang w:val="es-MX"/>
         </w:rPr>
-        <w:t>El backend valida la operación.</w:t>
+        <w:t xml:space="preserve">El </w:t>
+      </w:r>
+      <w:proofErr w:type="spellStart"/>
+      <w:r>
+        <w:rPr>
+          <w:lang w:val="es-MX"/>
+        </w:rPr>
+        <w:t>backend</w:t>
+      </w:r>
+      <w:proofErr w:type="spellEnd"/>
+      <w:r>
+        <w:rPr>
+          <w:lang w:val="es-MX"/>
+        </w:rPr>
+        <w:t xml:space="preserve"> valida la operación.</w:t>
       </w:r>
     </w:p>
     <w:p>
@@ -16817,7 +17139,7 @@
           <w:lang w:val="es-MX"/>
         </w:rPr>
       </w:pPr>
-      <w:bookmarkStart w:id="48" w:name="_Toc242812816"/>
+      <w:bookmarkStart w:id="48" w:name="_Toc243037683"/>
       <w:r>
         <w:rPr>
           <w:lang w:val="es-MX"/>
@@ -16901,7 +17223,7 @@
           <w:lang w:val="es-MX"/>
         </w:rPr>
       </w:pPr>
-      <w:bookmarkStart w:id="49" w:name="_Toc242812817"/>
+      <w:bookmarkStart w:id="49" w:name="_Toc243037684"/>
       <w:r>
         <w:rPr>
           <w:lang w:val="es-MX"/>
@@ -16982,7 +17304,7 @@
           <w:lang w:val="es-MX"/>
         </w:rPr>
       </w:pPr>
-      <w:bookmarkStart w:id="50" w:name="_Toc242812818"/>
+      <w:bookmarkStart w:id="50" w:name="_Toc243037685"/>
       <w:r>
         <w:rPr>
           <w:lang w:val="es-MX"/>
@@ -17270,7 +17592,7 @@
           <w:lang w:val="es-MX"/>
         </w:rPr>
       </w:pPr>
-      <w:bookmarkStart w:id="51" w:name="_Toc242812819"/>
+      <w:bookmarkStart w:id="51" w:name="_Toc243037686"/>
       <w:r>
         <w:rPr>
           <w:lang w:val="es-MX"/>
@@ -17361,7 +17683,21 @@
         <w:rPr>
           <w:lang w:val="es-MX"/>
         </w:rPr>
-        <w:t>El backend aplica la corrección.</w:t>
+        <w:t xml:space="preserve">El </w:t>
+      </w:r>
+      <w:proofErr w:type="spellStart"/>
+      <w:r>
+        <w:rPr>
+          <w:lang w:val="es-MX"/>
+        </w:rPr>
+        <w:t>backend</w:t>
+      </w:r>
+      <w:proofErr w:type="spellEnd"/>
+      <w:r>
+        <w:rPr>
+          <w:lang w:val="es-MX"/>
+        </w:rPr>
+        <w:t xml:space="preserve"> aplica la corrección.</w:t>
       </w:r>
     </w:p>
     <w:p>
@@ -17388,7 +17724,7 @@
           <w:lang w:val="es-MX"/>
         </w:rPr>
       </w:pPr>
-      <w:bookmarkStart w:id="52" w:name="_Toc242812820"/>
+      <w:bookmarkStart w:id="52" w:name="_Toc243037687"/>
       <w:r>
         <w:rPr>
           <w:lang w:val="es-MX"/>
@@ -17472,7 +17808,7 @@
           <w:lang w:val="es-MX"/>
         </w:rPr>
       </w:pPr>
-      <w:bookmarkStart w:id="53" w:name="_Toc242812821"/>
+      <w:bookmarkStart w:id="53" w:name="_Toc243037688"/>
       <w:r>
         <w:rPr>
           <w:lang w:val="es-MX"/>
@@ -17491,7 +17827,21 @@
         <w:rPr>
           <w:lang w:val="es-MX"/>
         </w:rPr>
-        <w:t>- &lt;&lt;extend&gt;&gt; CU-10, Cerrar caja, en el sentido de que la corrección es una operación complementaria a la gestión del corte.</w:t>
+        <w:t>- &lt;&lt;</w:t>
+      </w:r>
+      <w:proofErr w:type="spellStart"/>
+      <w:r>
+        <w:rPr>
+          <w:lang w:val="es-MX"/>
+        </w:rPr>
+        <w:t>extend</w:t>
+      </w:r>
+      <w:proofErr w:type="spellEnd"/>
+      <w:r>
+        <w:rPr>
+          <w:lang w:val="es-MX"/>
+        </w:rPr>
+        <w:t>&gt;&gt; CU-10, Cerrar caja, en el sentido de que la corrección es una operación complementaria a la gestión del corte.</w:t>
       </w:r>
     </w:p>
     <w:p>
@@ -17536,7 +17886,7 @@
           <w:lang w:val="es-MX"/>
         </w:rPr>
       </w:pPr>
-      <w:bookmarkStart w:id="54" w:name="_Toc242812822"/>
+      <w:bookmarkStart w:id="54" w:name="_Toc243037689"/>
       <w:r>
         <w:rPr>
           <w:lang w:val="es-MX"/>
@@ -17824,7 +18174,7 @@
           <w:lang w:val="es-MX"/>
         </w:rPr>
       </w:pPr>
-      <w:bookmarkStart w:id="55" w:name="_Toc242812823"/>
+      <w:bookmarkStart w:id="55" w:name="_Toc243037690"/>
       <w:r>
         <w:rPr>
           <w:lang w:val="es-MX"/>
@@ -17898,7 +18248,21 @@
         <w:rPr>
           <w:lang w:val="es-MX"/>
         </w:rPr>
-        <w:t>El backend registra la operación de reapertura.</w:t>
+        <w:t xml:space="preserve">El </w:t>
+      </w:r>
+      <w:proofErr w:type="spellStart"/>
+      <w:r>
+        <w:rPr>
+          <w:lang w:val="es-MX"/>
+        </w:rPr>
+        <w:t>backend</w:t>
+      </w:r>
+      <w:proofErr w:type="spellEnd"/>
+      <w:r>
+        <w:rPr>
+          <w:lang w:val="es-MX"/>
+        </w:rPr>
+        <w:t xml:space="preserve"> registra la operación de reapertura.</w:t>
       </w:r>
     </w:p>
     <w:p>
@@ -17942,7 +18306,7 @@
           <w:lang w:val="es-MX"/>
         </w:rPr>
       </w:pPr>
-      <w:bookmarkStart w:id="56" w:name="_Toc242812824"/>
+      <w:bookmarkStart w:id="56" w:name="_Toc243037691"/>
       <w:r>
         <w:rPr>
           <w:lang w:val="es-MX"/>
@@ -18026,7 +18390,7 @@
           <w:lang w:val="es-MX"/>
         </w:rPr>
       </w:pPr>
-      <w:bookmarkStart w:id="57" w:name="_Toc242812825"/>
+      <w:bookmarkStart w:id="57" w:name="_Toc243037692"/>
       <w:r>
         <w:rPr>
           <w:lang w:val="es-MX"/>
@@ -18124,7 +18488,7 @@
           <w:lang w:val="es-MX"/>
         </w:rPr>
       </w:pPr>
-      <w:bookmarkStart w:id="58" w:name="_Toc242812826"/>
+      <w:bookmarkStart w:id="58" w:name="_Toc243037693"/>
       <w:r>
         <w:rPr>
           <w:lang w:val="es-MX"/>
@@ -18460,7 +18824,7 @@
           <w:lang w:val="es-MX"/>
         </w:rPr>
       </w:pPr>
-      <w:bookmarkStart w:id="59" w:name="_Toc242812827"/>
+      <w:bookmarkStart w:id="59" w:name="_Toc243037694"/>
       <w:r>
         <w:rPr>
           <w:lang w:val="es-MX"/>
@@ -18598,7 +18962,25 @@
           <w:szCs w:val="20"/>
           <w:lang w:val="es-MX"/>
         </w:rPr>
-        <w:t>El backend aplica el cambio.</w:t>
+        <w:t xml:space="preserve">El </w:t>
+      </w:r>
+      <w:proofErr w:type="spellStart"/>
+      <w:r>
+        <w:rPr>
+          <w:sz w:val="20"/>
+          <w:szCs w:val="20"/>
+          <w:lang w:val="es-MX"/>
+        </w:rPr>
+        <w:t>backend</w:t>
+      </w:r>
+      <w:proofErr w:type="spellEnd"/>
+      <w:r>
+        <w:rPr>
+          <w:sz w:val="20"/>
+          <w:szCs w:val="20"/>
+          <w:lang w:val="es-MX"/>
+        </w:rPr>
+        <w:t xml:space="preserve"> aplica el cambio.</w:t>
       </w:r>
     </w:p>
     <w:p>
@@ -18630,7 +19012,7 @@
           <w:lang w:val="es-MX"/>
         </w:rPr>
       </w:pPr>
-      <w:bookmarkStart w:id="60" w:name="_Toc242812828"/>
+      <w:bookmarkStart w:id="60" w:name="_Toc243037695"/>
       <w:r>
         <w:rPr>
           <w:lang w:val="es-MX"/>
@@ -18800,7 +19182,7 @@
           <w:lang w:val="es-MX"/>
         </w:rPr>
       </w:pPr>
-      <w:bookmarkStart w:id="61" w:name="_Toc242812829"/>
+      <w:bookmarkStart w:id="61" w:name="_Toc243037696"/>
       <w:r>
         <w:rPr>
           <w:lang w:val="es-MX"/>
@@ -18904,7 +19286,7 @@
           <w:lang w:val="es-MX"/>
         </w:rPr>
       </w:pPr>
-      <w:bookmarkStart w:id="62" w:name="_Toc242812830"/>
+      <w:bookmarkStart w:id="62" w:name="_Toc243037697"/>
       <w:r>
         <w:rPr>
           <w:lang w:val="es-MX"/>
@@ -18964,7 +19346,7 @@
           <w:lang w:val="es-MX"/>
         </w:rPr>
       </w:pPr>
-      <w:bookmarkStart w:id="63" w:name="_Toc242812831"/>
+      <w:bookmarkStart w:id="63" w:name="_Toc243037698"/>
       <w:r>
         <w:rPr>
           <w:lang w:val="es-MX"/>
@@ -19252,7 +19634,7 @@
           <w:lang w:val="es-MX"/>
         </w:rPr>
       </w:pPr>
-      <w:bookmarkStart w:id="64" w:name="_Toc242812832"/>
+      <w:bookmarkStart w:id="64" w:name="_Toc243037699"/>
       <w:r>
         <w:rPr>
           <w:lang w:val="es-MX"/>
@@ -19360,7 +19742,21 @@
         <w:rPr>
           <w:lang w:val="es-MX"/>
         </w:rPr>
-        <w:t>El backend registra la compra o recepción.</w:t>
+        <w:t xml:space="preserve">El </w:t>
+      </w:r>
+      <w:proofErr w:type="spellStart"/>
+      <w:r>
+        <w:rPr>
+          <w:lang w:val="es-MX"/>
+        </w:rPr>
+        <w:t>backend</w:t>
+      </w:r>
+      <w:proofErr w:type="spellEnd"/>
+      <w:r>
+        <w:rPr>
+          <w:lang w:val="es-MX"/>
+        </w:rPr>
+        <w:t xml:space="preserve"> registra la compra o recepción.</w:t>
       </w:r>
     </w:p>
     <w:p>
@@ -19404,7 +19800,7 @@
           <w:lang w:val="es-MX"/>
         </w:rPr>
       </w:pPr>
-      <w:bookmarkStart w:id="65" w:name="_Toc242812833"/>
+      <w:bookmarkStart w:id="65" w:name="_Toc243037700"/>
       <w:r>
         <w:rPr>
           <w:lang w:val="es-MX"/>
@@ -19488,7 +19884,7 @@
           <w:lang w:val="es-MX"/>
         </w:rPr>
       </w:pPr>
-      <w:bookmarkStart w:id="66" w:name="_Toc242812834"/>
+      <w:bookmarkStart w:id="66" w:name="_Toc243037701"/>
       <w:r>
         <w:rPr>
           <w:lang w:val="es-MX"/>
@@ -19554,7 +19950,7 @@
           <w:lang w:val="es-MX"/>
         </w:rPr>
       </w:pPr>
-      <w:bookmarkStart w:id="67" w:name="_Toc242812835"/>
+      <w:bookmarkStart w:id="67" w:name="_Toc243037702"/>
       <w:r>
         <w:rPr>
           <w:lang w:val="es-MX"/>
@@ -19842,7 +20238,7 @@
           <w:lang w:val="es-MX"/>
         </w:rPr>
       </w:pPr>
-      <w:bookmarkStart w:id="68" w:name="_Toc242812836"/>
+      <w:bookmarkStart w:id="68" w:name="_Toc243037703"/>
       <w:r>
         <w:rPr>
           <w:lang w:val="es-MX"/>
@@ -19933,7 +20329,21 @@
         <w:rPr>
           <w:lang w:val="es-MX"/>
         </w:rPr>
-        <w:t>El backend registra el movimiento.</w:t>
+        <w:t xml:space="preserve">El </w:t>
+      </w:r>
+      <w:proofErr w:type="spellStart"/>
+      <w:r>
+        <w:rPr>
+          <w:lang w:val="es-MX"/>
+        </w:rPr>
+        <w:t>backend</w:t>
+      </w:r>
+      <w:proofErr w:type="spellEnd"/>
+      <w:r>
+        <w:rPr>
+          <w:lang w:val="es-MX"/>
+        </w:rPr>
+        <w:t xml:space="preserve"> registra el movimiento.</w:t>
       </w:r>
     </w:p>
     <w:p>
@@ -19990,7 +20400,7 @@
           <w:lang w:val="es-MX"/>
         </w:rPr>
       </w:pPr>
-      <w:bookmarkStart w:id="69" w:name="_Toc242812837"/>
+      <w:bookmarkStart w:id="69" w:name="_Toc243037704"/>
       <w:r>
         <w:rPr>
           <w:lang w:val="es-MX"/>
@@ -20074,7 +20484,7 @@
           <w:lang w:val="es-MX"/>
         </w:rPr>
       </w:pPr>
-      <w:bookmarkStart w:id="70" w:name="_Toc242812838"/>
+      <w:bookmarkStart w:id="70" w:name="_Toc243037705"/>
       <w:r>
         <w:rPr>
           <w:lang w:val="es-MX"/>
@@ -20145,7 +20555,7 @@
           <w:lang w:val="es-MX"/>
         </w:rPr>
       </w:pPr>
-      <w:bookmarkStart w:id="71" w:name="_Toc242812839"/>
+      <w:bookmarkStart w:id="71" w:name="_Toc243037706"/>
       <w:r>
         <w:rPr>
           <w:lang w:val="es-MX"/>
@@ -20433,7 +20843,7 @@
           <w:lang w:val="es-MX"/>
         </w:rPr>
       </w:pPr>
-      <w:bookmarkStart w:id="72" w:name="_Toc242812840"/>
+      <w:bookmarkStart w:id="72" w:name="_Toc243037707"/>
       <w:r>
         <w:rPr>
           <w:lang w:val="es-MX"/>
@@ -20541,7 +20951,21 @@
         <w:rPr>
           <w:lang w:val="es-MX"/>
         </w:rPr>
-        <w:t>El backend valida el estado del conteo.</w:t>
+        <w:t xml:space="preserve">El </w:t>
+      </w:r>
+      <w:proofErr w:type="spellStart"/>
+      <w:r>
+        <w:rPr>
+          <w:lang w:val="es-MX"/>
+        </w:rPr>
+        <w:t>backend</w:t>
+      </w:r>
+      <w:proofErr w:type="spellEnd"/>
+      <w:r>
+        <w:rPr>
+          <w:lang w:val="es-MX"/>
+        </w:rPr>
+        <w:t xml:space="preserve"> valida el estado del conteo.</w:t>
       </w:r>
     </w:p>
     <w:p>
@@ -20585,7 +21009,7 @@
           <w:lang w:val="es-MX"/>
         </w:rPr>
       </w:pPr>
-      <w:bookmarkStart w:id="73" w:name="_Toc242812841"/>
+      <w:bookmarkStart w:id="73" w:name="_Toc243037708"/>
       <w:r>
         <w:rPr>
           <w:lang w:val="es-MX"/>
@@ -20669,7 +21093,7 @@
           <w:lang w:val="es-MX"/>
         </w:rPr>
       </w:pPr>
-      <w:bookmarkStart w:id="74" w:name="_Toc242812842"/>
+      <w:bookmarkStart w:id="74" w:name="_Toc243037709"/>
       <w:r>
         <w:rPr>
           <w:lang w:val="es-MX"/>
@@ -20740,7 +21164,7 @@
           <w:lang w:val="es-MX"/>
         </w:rPr>
       </w:pPr>
-      <w:bookmarkStart w:id="75" w:name="_Toc242812843"/>
+      <w:bookmarkStart w:id="75" w:name="_Toc243037710"/>
       <w:r>
         <w:rPr>
           <w:lang w:val="es-MX"/>
@@ -21028,7 +21452,7 @@
           <w:lang w:val="es-MX"/>
         </w:rPr>
       </w:pPr>
-      <w:bookmarkStart w:id="76" w:name="_Toc242812844"/>
+      <w:bookmarkStart w:id="76" w:name="_Toc243037711"/>
       <w:r>
         <w:rPr>
           <w:lang w:val="es-MX"/>
@@ -21119,7 +21543,21 @@
         <w:rPr>
           <w:lang w:val="es-MX"/>
         </w:rPr>
-        <w:t>El backend registra el gasto.</w:t>
+        <w:t xml:space="preserve">El </w:t>
+      </w:r>
+      <w:proofErr w:type="spellStart"/>
+      <w:r>
+        <w:rPr>
+          <w:lang w:val="es-MX"/>
+        </w:rPr>
+        <w:t>backend</w:t>
+      </w:r>
+      <w:proofErr w:type="spellEnd"/>
+      <w:r>
+        <w:rPr>
+          <w:lang w:val="es-MX"/>
+        </w:rPr>
+        <w:t xml:space="preserve"> registra el gasto.</w:t>
       </w:r>
     </w:p>
     <w:p>
@@ -21163,7 +21601,7 @@
           <w:lang w:val="es-MX"/>
         </w:rPr>
       </w:pPr>
-      <w:bookmarkStart w:id="77" w:name="_Toc242812845"/>
+      <w:bookmarkStart w:id="77" w:name="_Toc243037712"/>
       <w:r>
         <w:rPr>
           <w:lang w:val="es-MX"/>
@@ -21230,7 +21668,7 @@
           <w:lang w:val="es-MX"/>
         </w:rPr>
       </w:pPr>
-      <w:bookmarkStart w:id="78" w:name="_Toc242812846"/>
+      <w:bookmarkStart w:id="78" w:name="_Toc243037713"/>
       <w:r>
         <w:rPr>
           <w:lang w:val="es-MX"/>
@@ -21270,7 +21708,21 @@
         <w:rPr>
           <w:lang w:val="es-MX"/>
         </w:rPr>
-        <w:t>Puede afectar las métricas del dashboard.</w:t>
+        <w:t xml:space="preserve">Puede afectar las métricas del </w:t>
+      </w:r>
+      <w:proofErr w:type="spellStart"/>
+      <w:r>
+        <w:rPr>
+          <w:lang w:val="es-MX"/>
+        </w:rPr>
+        <w:t>dashboard</w:t>
+      </w:r>
+      <w:proofErr w:type="spellEnd"/>
+      <w:r>
+        <w:rPr>
+          <w:lang w:val="es-MX"/>
+        </w:rPr>
+        <w:t>.</w:t>
       </w:r>
     </w:p>
     <w:p>
@@ -21315,7 +21767,7 @@
           <w:lang w:val="es-MX"/>
         </w:rPr>
       </w:pPr>
-      <w:bookmarkStart w:id="79" w:name="_Toc242812847"/>
+      <w:bookmarkStart w:id="79" w:name="_Toc243037714"/>
       <w:r>
         <w:rPr>
           <w:lang w:val="es-MX"/>
@@ -21603,7 +22055,7 @@
           <w:lang w:val="es-MX"/>
         </w:rPr>
       </w:pPr>
-      <w:bookmarkStart w:id="80" w:name="_Toc242812848"/>
+      <w:bookmarkStart w:id="80" w:name="_Toc243037715"/>
       <w:r>
         <w:rPr>
           <w:lang w:val="es-MX"/>
@@ -21677,7 +22129,21 @@
         <w:rPr>
           <w:lang w:val="es-MX"/>
         </w:rPr>
-        <w:t>El backend obtiene los datos relevantes de ventas, costos y gastos.</w:t>
+        <w:t xml:space="preserve">El </w:t>
+      </w:r>
+      <w:proofErr w:type="spellStart"/>
+      <w:r>
+        <w:rPr>
+          <w:lang w:val="es-MX"/>
+        </w:rPr>
+        <w:t>backend</w:t>
+      </w:r>
+      <w:proofErr w:type="spellEnd"/>
+      <w:r>
+        <w:rPr>
+          <w:lang w:val="es-MX"/>
+        </w:rPr>
+        <w:t xml:space="preserve"> obtiene los datos relevantes de ventas, costos y gastos.</w:t>
       </w:r>
     </w:p>
     <w:p>
@@ -21738,7 +22204,7 @@
           <w:lang w:val="es-MX"/>
         </w:rPr>
       </w:pPr>
-      <w:bookmarkStart w:id="81" w:name="_Toc242812849"/>
+      <w:bookmarkStart w:id="81" w:name="_Toc243037716"/>
       <w:r>
         <w:rPr>
           <w:lang w:val="es-MX"/>
@@ -21822,7 +22288,7 @@
           <w:lang w:val="es-MX"/>
         </w:rPr>
       </w:pPr>
-      <w:bookmarkStart w:id="82" w:name="_Toc242812850"/>
+      <w:bookmarkStart w:id="82" w:name="_Toc243037717"/>
       <w:r>
         <w:rPr>
           <w:lang w:val="es-MX"/>
@@ -21893,15 +22359,23 @@
           <w:lang w:val="es-MX"/>
         </w:rPr>
       </w:pPr>
-      <w:bookmarkStart w:id="83" w:name="_Toc242812851"/>
+      <w:bookmarkStart w:id="83" w:name="_Toc243037718"/>
       <w:r>
         <w:rPr>
           <w:lang w:val="es-MX"/>
         </w:rPr>
         <w:lastRenderedPageBreak/>
-        <w:t>CU-19. Consultar dashboard</w:t>
+        <w:t xml:space="preserve">CU-19. Consultar </w:t>
+      </w:r>
+      <w:proofErr w:type="spellStart"/>
+      <w:r>
+        <w:rPr>
+          <w:lang w:val="es-MX"/>
+        </w:rPr>
+        <w:t>dashboard</w:t>
       </w:r>
       <w:bookmarkEnd w:id="83"/>
+      <w:proofErr w:type="spellEnd"/>
     </w:p>
     <w:tbl>
       <w:tblPr>
@@ -22126,7 +22600,21 @@
               <w:rPr>
                 <w:lang w:val="es-MX"/>
               </w:rPr>
-              <w:t>El usuario accede al dashboard.</w:t>
+              <w:t xml:space="preserve">El usuario accede al </w:t>
+            </w:r>
+            <w:proofErr w:type="spellStart"/>
+            <w:r>
+              <w:rPr>
+                <w:lang w:val="es-MX"/>
+              </w:rPr>
+              <w:t>dashboard</w:t>
+            </w:r>
+            <w:proofErr w:type="spellEnd"/>
+            <w:r>
+              <w:rPr>
+                <w:lang w:val="es-MX"/>
+              </w:rPr>
+              <w:t>.</w:t>
             </w:r>
           </w:p>
         </w:tc>
@@ -22181,7 +22669,7 @@
           <w:lang w:val="es-MX"/>
         </w:rPr>
       </w:pPr>
-      <w:bookmarkStart w:id="84" w:name="_Toc242812852"/>
+      <w:bookmarkStart w:id="84" w:name="_Toc243037719"/>
       <w:r>
         <w:rPr>
           <w:lang w:val="es-MX"/>
@@ -22204,7 +22692,21 @@
         <w:rPr>
           <w:lang w:val="es-MX"/>
         </w:rPr>
-        <w:t>El usuario accede al dashboard.</w:t>
+        <w:t xml:space="preserve">El usuario accede al </w:t>
+      </w:r>
+      <w:proofErr w:type="spellStart"/>
+      <w:r>
+        <w:rPr>
+          <w:lang w:val="es-MX"/>
+        </w:rPr>
+        <w:t>dashboard</w:t>
+      </w:r>
+      <w:proofErr w:type="spellEnd"/>
+      <w:r>
+        <w:rPr>
+          <w:lang w:val="es-MX"/>
+        </w:rPr>
+        <w:t>.</w:t>
       </w:r>
     </w:p>
     <w:p>
@@ -22221,7 +22723,21 @@
         <w:rPr>
           <w:lang w:val="es-MX"/>
         </w:rPr>
-        <w:t>El frontend solicita los datos necesarios.</w:t>
+        <w:t xml:space="preserve">El </w:t>
+      </w:r>
+      <w:proofErr w:type="spellStart"/>
+      <w:r>
+        <w:rPr>
+          <w:lang w:val="es-MX"/>
+        </w:rPr>
+        <w:t>frontend</w:t>
+      </w:r>
+      <w:proofErr w:type="spellEnd"/>
+      <w:r>
+        <w:rPr>
+          <w:lang w:val="es-MX"/>
+        </w:rPr>
+        <w:t xml:space="preserve"> solicita los datos necesarios.</w:t>
       </w:r>
     </w:p>
     <w:p>
@@ -22238,7 +22754,21 @@
         <w:rPr>
           <w:lang w:val="es-MX"/>
         </w:rPr>
-        <w:t>El backend valida la sesión y los permisos.</w:t>
+        <w:t xml:space="preserve">El </w:t>
+      </w:r>
+      <w:proofErr w:type="spellStart"/>
+      <w:r>
+        <w:rPr>
+          <w:lang w:val="es-MX"/>
+        </w:rPr>
+        <w:t>backend</w:t>
+      </w:r>
+      <w:proofErr w:type="spellEnd"/>
+      <w:r>
+        <w:rPr>
+          <w:lang w:val="es-MX"/>
+        </w:rPr>
+        <w:t xml:space="preserve"> valida la sesión y los permisos.</w:t>
       </w:r>
     </w:p>
     <w:p>
@@ -22272,7 +22802,21 @@
         <w:rPr>
           <w:lang w:val="es-MX"/>
         </w:rPr>
-        <w:t>El frontend presenta los datos.</w:t>
+        <w:t xml:space="preserve">El </w:t>
+      </w:r>
+      <w:proofErr w:type="spellStart"/>
+      <w:r>
+        <w:rPr>
+          <w:lang w:val="es-MX"/>
+        </w:rPr>
+        <w:t>frontend</w:t>
+      </w:r>
+      <w:proofErr w:type="spellEnd"/>
+      <w:r>
+        <w:rPr>
+          <w:lang w:val="es-MX"/>
+        </w:rPr>
+        <w:t xml:space="preserve"> presenta los datos.</w:t>
       </w:r>
     </w:p>
     <w:p>
@@ -22303,7 +22847,7 @@
           <w:lang w:val="es-MX"/>
         </w:rPr>
       </w:pPr>
-      <w:bookmarkStart w:id="85" w:name="_Toc242812853"/>
+      <w:bookmarkStart w:id="85" w:name="_Toc243037720"/>
       <w:r>
         <w:rPr>
           <w:lang w:val="es-MX"/>
@@ -22393,7 +22937,7 @@
           <w:lang w:val="es-MX"/>
         </w:rPr>
       </w:pPr>
-      <w:bookmarkStart w:id="86" w:name="_Toc242812854"/>
+      <w:bookmarkStart w:id="86" w:name="_Toc243037721"/>
       <w:r>
         <w:rPr>
           <w:lang w:val="es-MX"/>
@@ -22433,7 +22977,21 @@
         <w:rPr>
           <w:lang w:val="es-MX"/>
         </w:rPr>
-        <w:t>Se apoya en las reglas de autorización del backend.</w:t>
+        <w:t xml:space="preserve">Se apoya en las reglas de autorización del </w:t>
+      </w:r>
+      <w:proofErr w:type="spellStart"/>
+      <w:r>
+        <w:rPr>
+          <w:lang w:val="es-MX"/>
+        </w:rPr>
+        <w:t>backend</w:t>
+      </w:r>
+      <w:proofErr w:type="spellEnd"/>
+      <w:r>
+        <w:rPr>
+          <w:lang w:val="es-MX"/>
+        </w:rPr>
+        <w:t>.</w:t>
       </w:r>
     </w:p>
     <w:p>
@@ -22478,7 +23036,7 @@
           <w:lang w:val="es-MX"/>
         </w:rPr>
       </w:pPr>
-      <w:bookmarkStart w:id="87" w:name="_Toc242812855"/>
+      <w:bookmarkStart w:id="87" w:name="_Toc243037722"/>
       <w:r>
         <w:rPr>
           <w:lang w:val="es-MX"/>
@@ -22766,7 +23324,7 @@
           <w:lang w:val="es-MX"/>
         </w:rPr>
       </w:pPr>
-      <w:bookmarkStart w:id="88" w:name="_Toc242812856"/>
+      <w:bookmarkStart w:id="88" w:name="_Toc243037723"/>
       <w:r>
         <w:rPr>
           <w:lang w:val="es-MX"/>
@@ -22901,7 +23459,7 @@
           <w:lang w:val="es-MX"/>
         </w:rPr>
       </w:pPr>
-      <w:bookmarkStart w:id="89" w:name="_Toc242812857"/>
+      <w:bookmarkStart w:id="89" w:name="_Toc243037724"/>
       <w:r>
         <w:rPr>
           <w:lang w:val="es-MX"/>
@@ -22941,7 +23499,21 @@
         <w:rPr>
           <w:lang w:val="es-MX"/>
         </w:rPr>
-        <w:t>A2. El servicio no está disponible en el horario previsto: la recuperación o reejecución debe verificarse.</w:t>
+        <w:t xml:space="preserve">A2. El servicio no está disponible en el horario previsto: la recuperación o </w:t>
+      </w:r>
+      <w:proofErr w:type="spellStart"/>
+      <w:r>
+        <w:rPr>
+          <w:lang w:val="es-MX"/>
+        </w:rPr>
+        <w:t>reejecución</w:t>
+      </w:r>
+      <w:proofErr w:type="spellEnd"/>
+      <w:r>
+        <w:rPr>
+          <w:lang w:val="es-MX"/>
+        </w:rPr>
+        <w:t xml:space="preserve"> debe verificarse.</w:t>
       </w:r>
     </w:p>
     <w:p>
@@ -22985,7 +23557,7 @@
           <w:lang w:val="es-MX"/>
         </w:rPr>
       </w:pPr>
-      <w:bookmarkStart w:id="90" w:name="_Toc242812858"/>
+      <w:bookmarkStart w:id="90" w:name="_Toc243037725"/>
       <w:r>
         <w:rPr>
           <w:lang w:val="es-MX"/>
@@ -23051,7 +23623,7 @@
           <w:lang w:val="es-MX"/>
         </w:rPr>
       </w:pPr>
-      <w:bookmarkStart w:id="91" w:name="_Toc242812859"/>
+      <w:bookmarkStart w:id="91" w:name="_Toc243037726"/>
       <w:r>
         <w:rPr>
           <w:lang w:val="es-MX"/>
@@ -23346,7 +23918,7 @@
           <w:lang w:val="es-MX"/>
         </w:rPr>
       </w:pPr>
-      <w:bookmarkStart w:id="92" w:name="_Toc242812860"/>
+      <w:bookmarkStart w:id="92" w:name="_Toc243037727"/>
       <w:r>
         <w:rPr>
           <w:lang w:val="es-MX"/>
@@ -23452,7 +24024,7 @@
           <w:lang w:val="es-MX"/>
         </w:rPr>
       </w:pPr>
-      <w:bookmarkStart w:id="93" w:name="_Toc242812861"/>
+      <w:bookmarkStart w:id="93" w:name="_Toc243037728"/>
       <w:r>
         <w:rPr>
           <w:lang w:val="es-MX"/>
@@ -23522,7 +24094,7 @@
           <w:lang w:val="es-MX"/>
         </w:rPr>
       </w:pPr>
-      <w:bookmarkStart w:id="94" w:name="_Toc242812862"/>
+      <w:bookmarkStart w:id="94" w:name="_Toc243037729"/>
       <w:r>
         <w:rPr>
           <w:lang w:val="es-MX"/>
@@ -23638,7 +24210,7 @@
           <w:lang w:val="es-MX"/>
         </w:rPr>
       </w:pPr>
-      <w:bookmarkStart w:id="95" w:name="_Toc242812863"/>
+      <w:bookmarkStart w:id="95" w:name="_Toc243037730"/>
       <w:r>
         <w:rPr>
           <w:lang w:val="es-MX"/>
@@ -23933,7 +24505,7 @@
           <w:lang w:val="es-MX"/>
         </w:rPr>
       </w:pPr>
-      <w:bookmarkStart w:id="96" w:name="_Toc242812864"/>
+      <w:bookmarkStart w:id="96" w:name="_Toc243037731"/>
       <w:r>
         <w:rPr>
           <w:lang w:val="es-MX"/>
@@ -24029,7 +24601,21 @@
         <w:rPr>
           <w:lang w:val="es-MX"/>
         </w:rPr>
-        <w:t>El backend guarda los cambios autorizados.</w:t>
+        <w:t xml:space="preserve">El </w:t>
+      </w:r>
+      <w:proofErr w:type="spellStart"/>
+      <w:r>
+        <w:rPr>
+          <w:lang w:val="es-MX"/>
+        </w:rPr>
+        <w:t>backend</w:t>
+      </w:r>
+      <w:proofErr w:type="spellEnd"/>
+      <w:r>
+        <w:rPr>
+          <w:lang w:val="es-MX"/>
+        </w:rPr>
+        <w:t xml:space="preserve"> guarda los cambios autorizados.</w:t>
       </w:r>
     </w:p>
     <w:p>
@@ -24075,7 +24661,7 @@
           <w:lang w:val="es-MX"/>
         </w:rPr>
       </w:pPr>
-      <w:bookmarkStart w:id="97" w:name="_Toc242812865"/>
+      <w:bookmarkStart w:id="97" w:name="_Toc243037732"/>
       <w:r>
         <w:rPr>
           <w:lang w:val="es-MX"/>
@@ -24163,7 +24749,7 @@
           <w:lang w:val="es-MX"/>
         </w:rPr>
       </w:pPr>
-      <w:bookmarkStart w:id="98" w:name="_Toc242812866"/>
+      <w:bookmarkStart w:id="98" w:name="_Toc243037733"/>
       <w:r>
         <w:rPr>
           <w:lang w:val="es-MX"/>
@@ -24243,7 +24829,7 @@
           <w:lang w:val="es-MX"/>
         </w:rPr>
       </w:pPr>
-      <w:bookmarkStart w:id="99" w:name="_Toc242812867"/>
+      <w:bookmarkStart w:id="99" w:name="_Toc243037734"/>
       <w:r>
         <w:rPr>
           <w:lang w:val="es-MX"/>
@@ -24413,7 +24999,21 @@
               <w:rPr>
                 <w:lang w:val="es-MX"/>
               </w:rPr>
-              <w:t>&lt;&lt;include&gt;&gt; condicional, pendiente de confirmar</w:t>
+              <w:t>&lt;&lt;</w:t>
+            </w:r>
+            <w:proofErr w:type="spellStart"/>
+            <w:r>
+              <w:rPr>
+                <w:lang w:val="es-MX"/>
+              </w:rPr>
+              <w:t>include</w:t>
+            </w:r>
+            <w:proofErr w:type="spellEnd"/>
+            <w:r>
+              <w:rPr>
+                <w:lang w:val="es-MX"/>
+              </w:rPr>
+              <w:t>&gt;&gt; condicional, pendiente de confirmar</w:t>
             </w:r>
           </w:p>
         </w:tc>
@@ -24495,7 +25095,21 @@
               <w:rPr>
                 <w:lang w:val="es-MX"/>
               </w:rPr>
-              <w:t>&lt;&lt;extend&gt;&gt;</w:t>
+              <w:t>&lt;&lt;</w:t>
+            </w:r>
+            <w:proofErr w:type="spellStart"/>
+            <w:r>
+              <w:rPr>
+                <w:lang w:val="es-MX"/>
+              </w:rPr>
+              <w:t>extend</w:t>
+            </w:r>
+            <w:proofErr w:type="spellEnd"/>
+            <w:r>
+              <w:rPr>
+                <w:lang w:val="es-MX"/>
+              </w:rPr>
+              <w:t>&gt;&gt;</w:t>
             </w:r>
           </w:p>
         </w:tc>
@@ -24577,7 +25191,21 @@
               <w:rPr>
                 <w:lang w:val="es-MX"/>
               </w:rPr>
-              <w:t>&lt;&lt;extend&gt;&gt;</w:t>
+              <w:t>&lt;&lt;</w:t>
+            </w:r>
+            <w:proofErr w:type="spellStart"/>
+            <w:r>
+              <w:rPr>
+                <w:lang w:val="es-MX"/>
+              </w:rPr>
+              <w:t>extend</w:t>
+            </w:r>
+            <w:proofErr w:type="spellEnd"/>
+            <w:r>
+              <w:rPr>
+                <w:lang w:val="es-MX"/>
+              </w:rPr>
+              <w:t>&gt;&gt;</w:t>
             </w:r>
           </w:p>
         </w:tc>
@@ -24659,7 +25287,21 @@
               <w:rPr>
                 <w:lang w:val="es-MX"/>
               </w:rPr>
-              <w:t>&lt;&lt;extend&gt;&gt;</w:t>
+              <w:t>&lt;&lt;</w:t>
+            </w:r>
+            <w:proofErr w:type="spellStart"/>
+            <w:r>
+              <w:rPr>
+                <w:lang w:val="es-MX"/>
+              </w:rPr>
+              <w:t>extend</w:t>
+            </w:r>
+            <w:proofErr w:type="spellEnd"/>
+            <w:r>
+              <w:rPr>
+                <w:lang w:val="es-MX"/>
+              </w:rPr>
+              <w:t>&gt;&gt;</w:t>
             </w:r>
           </w:p>
         </w:tc>
@@ -36709,28 +37351,28 @@
 </file>
 
 <file path=customXml/item1.xml><?xml version="1.0" encoding="utf-8"?>
+<b:Sources xmlns:b="http://schemas.openxmlformats.org/officeDocument/2006/bibliography" xmlns="http://schemas.openxmlformats.org/officeDocument/2006/bibliography" SelectedStyle="\APASixthEditionOfficeOnline.xsl" StyleName="APA" Version="6"/>
+</file>
+
+<file path=customXml/item2.xml><?xml version="1.0" encoding="utf-8"?>
 <go:gDocsCustomXmlDataStorage xmlns:go="http://customooxmlschemas.google.com/" xmlns:r="http://schemas.openxmlformats.org/officeDocument/2006/relationships" uri="GoogleDocsCustomDataVersion2">
   <go:docsCustomData xmlns:go="http://customooxmlschemas.google.com/" roundtripDataSignature="AMtx7mhj7b9Qk+PIz1qczXH27Mzj4NGSLA==">CgMxLjA4AHIhMXRXMWZxcHk2ZGxpZnQyNWU1RC1ManBLLVNidXgwNUJW</go:docsCustomData>
 </go:gDocsCustomXmlDataStorage>
 </file>
 
-<file path=customXml/item2.xml><?xml version="1.0" encoding="utf-8"?>
-<b:Sources xmlns:b="http://schemas.openxmlformats.org/officeDocument/2006/bibliography" xmlns="http://schemas.openxmlformats.org/officeDocument/2006/bibliography" SelectedStyle="\APASixthEditionOfficeOnline.xsl" StyleName="APA" Version="6"/>
+<file path=customXml/itemProps1.xml><?xml version="1.0" encoding="utf-8"?>
+<ds:datastoreItem xmlns:ds="http://schemas.openxmlformats.org/officeDocument/2006/customXml" ds:itemID="{77186193-1494-42B0-A644-24EC42F9450A}">
+  <ds:schemaRefs>
+    <ds:schemaRef ds:uri="http://schemas.openxmlformats.org/officeDocument/2006/bibliography"/>
+  </ds:schemaRefs>
+</ds:datastoreItem>
 </file>
 
-<file path=customXml/itemProps1.xml><?xml version="1.0" encoding="utf-8"?>
+<file path=customXml/itemProps2.xml><?xml version="1.0" encoding="utf-8"?>
 <ds:datastoreItem xmlns:ds="http://schemas.openxmlformats.org/officeDocument/2006/customXml" ds:itemID="{11111111-1234-1234-1234-123412341234}">
   <ds:schemaRefs>
     <ds:schemaRef ds:uri="http://customooxmlschemas.google.com/"/>
     <ds:schemaRef ds:uri="http://schemas.openxmlformats.org/officeDocument/2006/relationships"/>
   </ds:schemaRefs>
 </ds:datastoreItem>
-</file>
-
-<file path=customXml/itemProps2.xml><?xml version="1.0" encoding="utf-8"?>
-<ds:datastoreItem xmlns:ds="http://schemas.openxmlformats.org/officeDocument/2006/customXml" ds:itemID="{77186193-1494-42B0-A644-24EC42F9450A}">
-  <ds:schemaRefs>
-    <ds:schemaRef ds:uri="http://schemas.openxmlformats.org/officeDocument/2006/bibliography"/>
-  </ds:schemaRefs>
-</ds:datastoreItem>
 </file>
</xml_diff>